<commit_message>
fix business clearance document to add missic CTC no.
</commit_message>
<xml_diff>
--- a/public/files/BUSINESS-CLEARANCE.docx
+++ b/public/files/BUSINESS-CLEARANCE.docx
@@ -10,15 +10,15 @@
         <mc:AlternateContent>
           <mc:Choice Requires="wps">
             <w:drawing>
-              <wp:anchor distT="0" distB="0" distL="114300" distR="114300" simplePos="0" relativeHeight="251667456" behindDoc="0" locked="0" layoutInCell="1" allowOverlap="1" wp14:anchorId="720F7DE2" wp14:editId="5C30ED20">
+              <wp:anchor distT="0" distB="0" distL="114300" distR="114300" simplePos="0" relativeHeight="251667456" behindDoc="0" locked="0" layoutInCell="1" allowOverlap="1" wp14:anchorId="720F7DE2" wp14:editId="6DD03223">
                 <wp:simplePos x="0" y="0"/>
                 <wp:positionH relativeFrom="column">
-                  <wp:posOffset>-693420</wp:posOffset>
+                  <wp:posOffset>-697774</wp:posOffset>
                 </wp:positionH>
                 <wp:positionV relativeFrom="paragraph">
-                  <wp:posOffset>9283065</wp:posOffset>
+                  <wp:posOffset>9182917</wp:posOffset>
                 </wp:positionV>
-                <wp:extent cx="2727960" cy="518160"/>
+                <wp:extent cx="2727960" cy="632460"/>
                 <wp:effectExtent l="0" t="0" r="0" b="0"/>
                 <wp:wrapNone/>
                 <wp:docPr id="1263623297" name="Text Box 28"/>
@@ -30,7 +30,7 @@
                       <wps:spPr>
                         <a:xfrm>
                           <a:off x="0" y="0"/>
-                          <a:ext cx="2727960" cy="518160"/>
+                          <a:ext cx="2727960" cy="632460"/>
                         </a:xfrm>
                         <a:prstGeom prst="rect">
                           <a:avLst/>
@@ -60,95 +60,23 @@
                                 <w:rFonts w:ascii="Times New Roman" w:hAnsi="Times New Roman"/>
                                 <w:kern w:val="0"/>
                               </w:rPr>
-                              <w:t>D</w:t>
-                            </w:r>
-                            <w:r>
-                              <w:rPr>
-                                <w:rFonts w:ascii="Times New Roman" w:hAnsi="Times New Roman"/>
-                                <w:spacing w:val="-1"/>
-                                <w:kern w:val="0"/>
-                              </w:rPr>
-                              <w:t>a</w:t>
-                            </w:r>
-                            <w:r>
-                              <w:rPr>
-                                <w:rFonts w:ascii="Times New Roman" w:hAnsi="Times New Roman"/>
-                                <w:spacing w:val="3"/>
-                                <w:kern w:val="0"/>
-                              </w:rPr>
-                              <w:t>t</w:t>
-                            </w:r>
-                            <w:r>
-                              <w:rPr>
-                                <w:rFonts w:ascii="Times New Roman" w:hAnsi="Times New Roman"/>
-                                <w:kern w:val="0"/>
-                              </w:rPr>
-                              <w:t>e</w:t>
-                            </w:r>
-                            <w:r>
-                              <w:rPr>
-                                <w:rFonts w:ascii="Times New Roman" w:hAnsi="Times New Roman"/>
-                                <w:spacing w:val="9"/>
-                                <w:kern w:val="0"/>
-                              </w:rPr>
-                              <w:t xml:space="preserve"> </w:t>
-                            </w:r>
-                            <w:r>
-                              <w:rPr>
-                                <w:rFonts w:ascii="Times New Roman" w:hAnsi="Times New Roman"/>
-                                <w:spacing w:val="-1"/>
-                                <w:kern w:val="0"/>
-                              </w:rPr>
-                              <w:t>I</w:t>
-                            </w:r>
-                            <w:r>
-                              <w:rPr>
-                                <w:rFonts w:ascii="Times New Roman" w:hAnsi="Times New Roman"/>
-                                <w:kern w:val="0"/>
-                              </w:rPr>
-                              <w:t>ssu</w:t>
-                            </w:r>
-                            <w:r>
-                              <w:rPr>
-                                <w:rFonts w:ascii="Times New Roman" w:hAnsi="Times New Roman"/>
-                                <w:spacing w:val="-1"/>
-                                <w:kern w:val="0"/>
-                              </w:rPr>
-                              <w:t>e:</w:t>
-                            </w:r>
-                            <w:r>
-                              <w:rPr>
-                                <w:rFonts w:ascii="Times New Roman" w:hAnsi="Times New Roman"/>
-                                <w:spacing w:val="-1"/>
-                                <w:kern w:val="0"/>
-                              </w:rPr>
-                              <w:t xml:space="preserve"> </w:t>
-                            </w:r>
-                            <w:r>
-                              <w:rPr>
-                                <w:rFonts w:ascii="Times New Roman" w:hAnsi="Times New Roman"/>
-                                <w:spacing w:val="-1"/>
-                                <w:kern w:val="0"/>
-                              </w:rPr>
-                              <w:t>{</w:t>
+                              <w:t>CTC #: {</w:t>
                             </w:r>
                             <w:proofErr w:type="spellStart"/>
                             <w:r>
                               <w:rPr>
                                 <w:rFonts w:ascii="Times New Roman" w:hAnsi="Times New Roman"/>
-                                <w:spacing w:val="-1"/>
-                                <w:kern w:val="0"/>
-                              </w:rPr>
-                              <w:t>ctc_date_issued</w:t>
+                                <w:kern w:val="0"/>
+                              </w:rPr>
+                              <w:t>ctc_no</w:t>
                             </w:r>
                             <w:proofErr w:type="spellEnd"/>
                             <w:r>
                               <w:rPr>
                                 <w:rFonts w:ascii="Times New Roman" w:hAnsi="Times New Roman"/>
-                                <w:spacing w:val="-1"/>
-                                <w:kern w:val="0"/>
-                              </w:rPr>
-                              <w:t>}</w:t>
+                                <w:kern w:val="0"/>
+                              </w:rPr>
+                              <w:t xml:space="preserve">} </w:t>
                             </w:r>
                           </w:p>
                           <w:p>
@@ -165,97 +93,49 @@
                             <w:r>
                               <w:rPr>
                                 <w:rFonts w:ascii="Times New Roman" w:hAnsi="Times New Roman"/>
-                                <w:spacing w:val="1"/>
-                                <w:kern w:val="0"/>
-                              </w:rPr>
-                              <w:t>Pl</w:t>
-                            </w:r>
-                            <w:r>
-                              <w:rPr>
-                                <w:rFonts w:ascii="Times New Roman" w:hAnsi="Times New Roman"/>
-                                <w:spacing w:val="2"/>
-                                <w:kern w:val="0"/>
-                              </w:rPr>
-                              <w:t>a</w:t>
-                            </w:r>
-                            <w:r>
-                              <w:rPr>
-                                <w:rFonts w:ascii="Times New Roman" w:hAnsi="Times New Roman"/>
-                                <w:spacing w:val="-1"/>
-                                <w:kern w:val="0"/>
-                              </w:rPr>
-                              <w:t>c</w:t>
-                            </w:r>
-                            <w:r>
-                              <w:rPr>
-                                <w:rFonts w:ascii="Times New Roman" w:hAnsi="Times New Roman"/>
-                                <w:kern w:val="0"/>
-                              </w:rPr>
-                              <w:t>e</w:t>
-                            </w:r>
-                            <w:r>
-                              <w:rPr>
-                                <w:rFonts w:ascii="Times New Roman" w:hAnsi="Times New Roman"/>
-                                <w:spacing w:val="13"/>
-                                <w:kern w:val="0"/>
-                              </w:rPr>
-                              <w:t xml:space="preserve"> </w:t>
-                            </w:r>
-                            <w:r>
-                              <w:rPr>
-                                <w:rFonts w:ascii="Times New Roman" w:hAnsi="Times New Roman"/>
-                                <w:spacing w:val="-3"/>
-                                <w:w w:val="102"/>
-                                <w:kern w:val="0"/>
-                              </w:rPr>
-                              <w:t>I</w:t>
-                            </w:r>
-                            <w:r>
-                              <w:rPr>
-                                <w:rFonts w:ascii="Times New Roman" w:hAnsi="Times New Roman"/>
-                                <w:w w:val="102"/>
-                                <w:kern w:val="0"/>
-                              </w:rPr>
-                              <w:t>ssu</w:t>
-                            </w:r>
-                            <w:r>
-                              <w:rPr>
-                                <w:rFonts w:ascii="Times New Roman" w:hAnsi="Times New Roman"/>
-                                <w:spacing w:val="2"/>
-                                <w:w w:val="102"/>
-                                <w:kern w:val="0"/>
-                              </w:rPr>
-                              <w:t>e</w:t>
-                            </w:r>
-                            <w:r>
-                              <w:rPr>
-                                <w:rFonts w:ascii="Times New Roman" w:hAnsi="Times New Roman"/>
-                                <w:w w:val="102"/>
-                                <w:kern w:val="0"/>
-                              </w:rPr>
-                              <w:t>d:</w:t>
-                            </w:r>
-                            <w:r>
-                              <w:rPr>
-                                <w:rFonts w:ascii="Times New Roman" w:hAnsi="Times New Roman"/>
-                                <w:w w:val="102"/>
-                                <w:kern w:val="0"/>
-                              </w:rPr>
-                              <w:t xml:space="preserve"> </w:t>
-                            </w:r>
-                            <w:r>
-                              <w:rPr>
-                                <w:rFonts w:ascii="Times New Roman" w:hAnsi="Times New Roman"/>
-                                <w:w w:val="102"/>
-                                <w:kern w:val="0"/>
-                              </w:rPr>
-                              <w:t>{</w:t>
+                                <w:kern w:val="0"/>
+                              </w:rPr>
+                              <w:t>Date Issued: {</w:t>
                             </w:r>
                             <w:proofErr w:type="spellStart"/>
                             <w:r>
                               <w:rPr>
                                 <w:rFonts w:ascii="Times New Roman" w:hAnsi="Times New Roman"/>
-                                <w:w w:val="102"/>
+                                <w:kern w:val="0"/>
+                              </w:rPr>
+                              <w:t>ctc_date_issued</w:t>
+                            </w:r>
+                            <w:proofErr w:type="spellEnd"/>
+                            <w:r>
+                              <w:rPr>
+                                <w:rFonts w:ascii="Times New Roman" w:hAnsi="Times New Roman"/>
+                                <w:kern w:val="0"/>
+                              </w:rPr>
+                              <w:t xml:space="preserve">} </w:t>
+                            </w:r>
+                          </w:p>
+                          <w:p>
+                            <w:pPr>
+                              <w:widowControl w:val="0"/>
+                              <w:autoSpaceDE w:val="0"/>
+                              <w:spacing w:before="6" w:after="0" w:line="244" w:lineRule="auto"/>
+                              <w:ind w:right="825"/>
+                              <w:rPr>
+                                <w:rFonts w:ascii="Times New Roman" w:hAnsi="Times New Roman"/>
+                                <w:kern w:val="0"/>
+                              </w:rPr>
+                            </w:pPr>
+                            <w:r>
+                              <w:rPr>
+                                <w:rFonts w:ascii="Times New Roman" w:hAnsi="Times New Roman"/>
+                                <w:kern w:val="0"/>
+                              </w:rPr>
+                              <w:t>Place Issued: {</w:t>
+                            </w:r>
+                            <w:proofErr w:type="spellStart"/>
+                            <w:r>
+                              <w:rPr>
+                                <w:rFonts w:ascii="Times New Roman" w:hAnsi="Times New Roman"/>
                                 <w:kern w:val="0"/>
                               </w:rPr>
                               <w:t>ctc_place_issued</w:t>
@@ -264,11 +144,34 @@
                             <w:r>
                               <w:rPr>
                                 <w:rFonts w:ascii="Times New Roman" w:hAnsi="Times New Roman"/>
-                                <w:w w:val="102"/>
                                 <w:kern w:val="0"/>
                               </w:rPr>
                               <w:t>}</w:t>
                             </w:r>
+                          </w:p>
+                          <w:p>
+                            <w:pPr>
+                              <w:widowControl w:val="0"/>
+                              <w:autoSpaceDE w:val="0"/>
+                              <w:spacing w:before="6" w:after="0" w:line="244" w:lineRule="auto"/>
+                              <w:ind w:right="825"/>
+                              <w:rPr>
+                                <w:rFonts w:ascii="Times New Roman" w:hAnsi="Times New Roman"/>
+                                <w:kern w:val="0"/>
+                              </w:rPr>
+                            </w:pPr>
+                          </w:p>
+                          <w:p>
+                            <w:pPr>
+                              <w:widowControl w:val="0"/>
+                              <w:autoSpaceDE w:val="0"/>
+                              <w:spacing w:before="6" w:after="0" w:line="244" w:lineRule="auto"/>
+                              <w:ind w:right="825"/>
+                              <w:rPr>
+                                <w:rFonts w:ascii="Times New Roman" w:hAnsi="Times New Roman"/>
+                                <w:kern w:val="0"/>
+                              </w:rPr>
+                            </w:pPr>
                           </w:p>
                         </w:txbxContent>
                       </wps:txbx>
@@ -296,7 +199,7 @@
                 <v:stroke joinstyle="miter"/>
                 <v:path gradientshapeok="t" o:connecttype="rect"/>
               </v:shapetype>
-              <v:shape id="Text Box 28" o:spid="_x0000_s1026" type="#_x0000_t202" style="position:absolute;margin-left:-54.6pt;margin-top:730.95pt;width:214.8pt;height:40.8pt;z-index:251667456;visibility:visible;mso-wrap-style:square;mso-width-percent:0;mso-height-percent:0;mso-wrap-distance-left:9pt;mso-wrap-distance-top:0;mso-wrap-distance-right:9pt;mso-wrap-distance-bottom:0;mso-position-horizontal:absolute;mso-position-horizontal-relative:text;mso-position-vertical:absolute;mso-position-vertical-relative:text;mso-width-percent:0;mso-height-percent:0;mso-width-relative:margin;mso-height-relative:margin;v-text-anchor:top" o:gfxdata="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" fillcolor="white [3201]" stroked="f" strokeweight=".5pt">
+              <v:shape id="Text Box 28" o:spid="_x0000_s1026" type="#_x0000_t202" style="position:absolute;margin-left:-54.95pt;margin-top:723.05pt;width:214.8pt;height:49.8pt;z-index:251667456;visibility:visible;mso-wrap-style:square;mso-width-percent:0;mso-height-percent:0;mso-wrap-distance-left:9pt;mso-wrap-distance-top:0;mso-wrap-distance-right:9pt;mso-wrap-distance-bottom:0;mso-position-horizontal:absolute;mso-position-horizontal-relative:text;mso-position-vertical:absolute;mso-position-vertical-relative:text;mso-width-percent:0;mso-height-percent:0;mso-width-relative:margin;mso-height-relative:margin;v-text-anchor:top" o:gfxdata="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" fillcolor="white [3201]" stroked="f" strokeweight=".5pt">
                 <v:textbox>
                   <w:txbxContent>
                     <w:p>
@@ -315,95 +218,23 @@
                           <w:rFonts w:ascii="Times New Roman" w:hAnsi="Times New Roman"/>
                           <w:kern w:val="0"/>
                         </w:rPr>
-                        <w:t>D</w:t>
-                      </w:r>
-                      <w:r>
-                        <w:rPr>
-                          <w:rFonts w:ascii="Times New Roman" w:hAnsi="Times New Roman"/>
-                          <w:spacing w:val="-1"/>
-                          <w:kern w:val="0"/>
-                        </w:rPr>
-                        <w:t>a</w:t>
-                      </w:r>
-                      <w:r>
-                        <w:rPr>
-                          <w:rFonts w:ascii="Times New Roman" w:hAnsi="Times New Roman"/>
-                          <w:spacing w:val="3"/>
-                          <w:kern w:val="0"/>
-                        </w:rPr>
-                        <w:t>t</w:t>
-                      </w:r>
-                      <w:r>
-                        <w:rPr>
-                          <w:rFonts w:ascii="Times New Roman" w:hAnsi="Times New Roman"/>
-                          <w:kern w:val="0"/>
-                        </w:rPr>
-                        <w:t>e</w:t>
-                      </w:r>
-                      <w:r>
-                        <w:rPr>
-                          <w:rFonts w:ascii="Times New Roman" w:hAnsi="Times New Roman"/>
-                          <w:spacing w:val="9"/>
-                          <w:kern w:val="0"/>
-                        </w:rPr>
-                        <w:t xml:space="preserve"> </w:t>
-                      </w:r>
-                      <w:r>
-                        <w:rPr>
-                          <w:rFonts w:ascii="Times New Roman" w:hAnsi="Times New Roman"/>
-                          <w:spacing w:val="-1"/>
-                          <w:kern w:val="0"/>
-                        </w:rPr>
-                        <w:t>I</w:t>
-                      </w:r>
-                      <w:r>
-                        <w:rPr>
-                          <w:rFonts w:ascii="Times New Roman" w:hAnsi="Times New Roman"/>
-                          <w:kern w:val="0"/>
-                        </w:rPr>
-                        <w:t>ssu</w:t>
-                      </w:r>
-                      <w:r>
-                        <w:rPr>
-                          <w:rFonts w:ascii="Times New Roman" w:hAnsi="Times New Roman"/>
-                          <w:spacing w:val="-1"/>
-                          <w:kern w:val="0"/>
-                        </w:rPr>
-                        <w:t>e:</w:t>
-                      </w:r>
-                      <w:r>
-                        <w:rPr>
-                          <w:rFonts w:ascii="Times New Roman" w:hAnsi="Times New Roman"/>
-                          <w:spacing w:val="-1"/>
-                          <w:kern w:val="0"/>
-                        </w:rPr>
-                        <w:t xml:space="preserve"> </w:t>
-                      </w:r>
-                      <w:r>
-                        <w:rPr>
-                          <w:rFonts w:ascii="Times New Roman" w:hAnsi="Times New Roman"/>
-                          <w:spacing w:val="-1"/>
-                          <w:kern w:val="0"/>
-                        </w:rPr>
-                        <w:t>{</w:t>
+                        <w:t>CTC #: {</w:t>
                       </w:r>
                       <w:proofErr w:type="spellStart"/>
                       <w:r>
                         <w:rPr>
                           <w:rFonts w:ascii="Times New Roman" w:hAnsi="Times New Roman"/>
-                          <w:spacing w:val="-1"/>
-                          <w:kern w:val="0"/>
-                        </w:rPr>
-                        <w:t>ctc_date_issued</w:t>
+                          <w:kern w:val="0"/>
+                        </w:rPr>
+                        <w:t>ctc_no</w:t>
                       </w:r>
                       <w:proofErr w:type="spellEnd"/>
                       <w:r>
                         <w:rPr>
                           <w:rFonts w:ascii="Times New Roman" w:hAnsi="Times New Roman"/>
-                          <w:spacing w:val="-1"/>
-                          <w:kern w:val="0"/>
-                        </w:rPr>
-                        <w:t>}</w:t>
+                          <w:kern w:val="0"/>
+                        </w:rPr>
+                        <w:t xml:space="preserve">} </w:t>
                       </w:r>
                     </w:p>
                     <w:p>
@@ -420,97 +251,49 @@
                       <w:r>
                         <w:rPr>
                           <w:rFonts w:ascii="Times New Roman" w:hAnsi="Times New Roman"/>
-                          <w:spacing w:val="1"/>
-                          <w:kern w:val="0"/>
-                        </w:rPr>
-                        <w:t>Pl</w:t>
-                      </w:r>
-                      <w:r>
-                        <w:rPr>
-                          <w:rFonts w:ascii="Times New Roman" w:hAnsi="Times New Roman"/>
-                          <w:spacing w:val="2"/>
-                          <w:kern w:val="0"/>
-                        </w:rPr>
-                        <w:t>a</w:t>
-                      </w:r>
-                      <w:r>
-                        <w:rPr>
-                          <w:rFonts w:ascii="Times New Roman" w:hAnsi="Times New Roman"/>
-                          <w:spacing w:val="-1"/>
-                          <w:kern w:val="0"/>
-                        </w:rPr>
-                        <w:t>c</w:t>
-                      </w:r>
-                      <w:r>
-                        <w:rPr>
-                          <w:rFonts w:ascii="Times New Roman" w:hAnsi="Times New Roman"/>
-                          <w:kern w:val="0"/>
-                        </w:rPr>
-                        <w:t>e</w:t>
-                      </w:r>
-                      <w:r>
-                        <w:rPr>
-                          <w:rFonts w:ascii="Times New Roman" w:hAnsi="Times New Roman"/>
-                          <w:spacing w:val="13"/>
-                          <w:kern w:val="0"/>
-                        </w:rPr>
-                        <w:t xml:space="preserve"> </w:t>
-                      </w:r>
-                      <w:r>
-                        <w:rPr>
-                          <w:rFonts w:ascii="Times New Roman" w:hAnsi="Times New Roman"/>
-                          <w:spacing w:val="-3"/>
-                          <w:w w:val="102"/>
-                          <w:kern w:val="0"/>
-                        </w:rPr>
-                        <w:t>I</w:t>
-                      </w:r>
-                      <w:r>
-                        <w:rPr>
-                          <w:rFonts w:ascii="Times New Roman" w:hAnsi="Times New Roman"/>
-                          <w:w w:val="102"/>
-                          <w:kern w:val="0"/>
-                        </w:rPr>
-                        <w:t>ssu</w:t>
-                      </w:r>
-                      <w:r>
-                        <w:rPr>
-                          <w:rFonts w:ascii="Times New Roman" w:hAnsi="Times New Roman"/>
-                          <w:spacing w:val="2"/>
-                          <w:w w:val="102"/>
-                          <w:kern w:val="0"/>
-                        </w:rPr>
-                        <w:t>e</w:t>
-                      </w:r>
-                      <w:r>
-                        <w:rPr>
-                          <w:rFonts w:ascii="Times New Roman" w:hAnsi="Times New Roman"/>
-                          <w:w w:val="102"/>
-                          <w:kern w:val="0"/>
-                        </w:rPr>
-                        <w:t>d:</w:t>
-                      </w:r>
-                      <w:r>
-                        <w:rPr>
-                          <w:rFonts w:ascii="Times New Roman" w:hAnsi="Times New Roman"/>
-                          <w:w w:val="102"/>
-                          <w:kern w:val="0"/>
-                        </w:rPr>
-                        <w:t xml:space="preserve"> </w:t>
-                      </w:r>
-                      <w:r>
-                        <w:rPr>
-                          <w:rFonts w:ascii="Times New Roman" w:hAnsi="Times New Roman"/>
-                          <w:w w:val="102"/>
-                          <w:kern w:val="0"/>
-                        </w:rPr>
-                        <w:t>{</w:t>
+                          <w:kern w:val="0"/>
+                        </w:rPr>
+                        <w:t>Date Issued: {</w:t>
                       </w:r>
                       <w:proofErr w:type="spellStart"/>
                       <w:r>
                         <w:rPr>
                           <w:rFonts w:ascii="Times New Roman" w:hAnsi="Times New Roman"/>
-                          <w:w w:val="102"/>
+                          <w:kern w:val="0"/>
+                        </w:rPr>
+                        <w:t>ctc_date_issued</w:t>
+                      </w:r>
+                      <w:proofErr w:type="spellEnd"/>
+                      <w:r>
+                        <w:rPr>
+                          <w:rFonts w:ascii="Times New Roman" w:hAnsi="Times New Roman"/>
+                          <w:kern w:val="0"/>
+                        </w:rPr>
+                        <w:t xml:space="preserve">} </w:t>
+                      </w:r>
+                    </w:p>
+                    <w:p>
+                      <w:pPr>
+                        <w:widowControl w:val="0"/>
+                        <w:autoSpaceDE w:val="0"/>
+                        <w:spacing w:before="6" w:after="0" w:line="244" w:lineRule="auto"/>
+                        <w:ind w:right="825"/>
+                        <w:rPr>
+                          <w:rFonts w:ascii="Times New Roman" w:hAnsi="Times New Roman"/>
+                          <w:kern w:val="0"/>
+                        </w:rPr>
+                      </w:pPr>
+                      <w:r>
+                        <w:rPr>
+                          <w:rFonts w:ascii="Times New Roman" w:hAnsi="Times New Roman"/>
+                          <w:kern w:val="0"/>
+                        </w:rPr>
+                        <w:t>Place Issued: {</w:t>
+                      </w:r>
+                      <w:proofErr w:type="spellStart"/>
+                      <w:r>
+                        <w:rPr>
+                          <w:rFonts w:ascii="Times New Roman" w:hAnsi="Times New Roman"/>
                           <w:kern w:val="0"/>
                         </w:rPr>
                         <w:t>ctc_place_issued</w:t>
@@ -519,14 +302,989 @@
                       <w:r>
                         <w:rPr>
                           <w:rFonts w:ascii="Times New Roman" w:hAnsi="Times New Roman"/>
-                          <w:w w:val="102"/>
                           <w:kern w:val="0"/>
                         </w:rPr>
                         <w:t>}</w:t>
                       </w:r>
+                    </w:p>
+                    <w:p>
+                      <w:pPr>
+                        <w:widowControl w:val="0"/>
+                        <w:autoSpaceDE w:val="0"/>
+                        <w:spacing w:before="6" w:after="0" w:line="244" w:lineRule="auto"/>
+                        <w:ind w:right="825"/>
+                        <w:rPr>
+                          <w:rFonts w:ascii="Times New Roman" w:hAnsi="Times New Roman"/>
+                          <w:kern w:val="0"/>
+                        </w:rPr>
+                      </w:pPr>
+                    </w:p>
+                    <w:p>
+                      <w:pPr>
+                        <w:widowControl w:val="0"/>
+                        <w:autoSpaceDE w:val="0"/>
+                        <w:spacing w:before="6" w:after="0" w:line="244" w:lineRule="auto"/>
+                        <w:ind w:right="825"/>
+                        <w:rPr>
+                          <w:rFonts w:ascii="Times New Roman" w:hAnsi="Times New Roman"/>
+                          <w:kern w:val="0"/>
+                        </w:rPr>
+                      </w:pPr>
                     </w:p>
                   </w:txbxContent>
                 </v:textbox>
+              </v:shape>
+            </w:pict>
+          </mc:Fallback>
+        </mc:AlternateContent>
+      </w:r>
+      <w:r>
+        <w:rPr>
+          <w:noProof/>
+        </w:rPr>
+        <mc:AlternateContent>
+          <mc:Choice Requires="wps">
+            <w:drawing>
+              <wp:anchor distT="0" distB="0" distL="114300" distR="114300" simplePos="0" relativeHeight="251674624" behindDoc="0" locked="0" layoutInCell="1" allowOverlap="1" wp14:anchorId="6AB430F5" wp14:editId="40DBFDFC">
+                <wp:simplePos x="0" y="0"/>
+                <wp:positionH relativeFrom="column">
+                  <wp:posOffset>-732155</wp:posOffset>
+                </wp:positionH>
+                <wp:positionV relativeFrom="paragraph">
+                  <wp:posOffset>8953409</wp:posOffset>
+                </wp:positionV>
+                <wp:extent cx="2477822" cy="259080"/>
+                <wp:effectExtent l="0" t="0" r="0" b="7620"/>
+                <wp:wrapNone/>
+                <wp:docPr id="1858936305" name="Text Box 34"/>
+                <wp:cNvGraphicFramePr/>
+                <a:graphic xmlns:a="http://schemas.openxmlformats.org/drawingml/2006/main">
+                  <a:graphicData uri="http://schemas.microsoft.com/office/word/2010/wordprocessingShape">
+                    <wps:wsp>
+                      <wps:cNvSpPr txBox="1"/>
+                      <wps:spPr>
+                        <a:xfrm>
+                          <a:off x="0" y="0"/>
+                          <a:ext cx="2477822" cy="259080"/>
+                        </a:xfrm>
+                        <a:prstGeom prst="rect">
+                          <a:avLst/>
+                        </a:prstGeom>
+                        <a:solidFill>
+                          <a:schemeClr val="lt1"/>
+                        </a:solidFill>
+                        <a:ln w="6350">
+                          <a:noFill/>
+                        </a:ln>
+                      </wps:spPr>
+                      <wps:txbx>
+                        <w:txbxContent>
+                          <w:p>
+                            <w:pPr>
+                              <w:widowControl w:val="0"/>
+                              <w:autoSpaceDE w:val="0"/>
+                              <w:spacing w:after="0" w:line="240" w:lineRule="auto"/>
+                              <w:ind w:left="118"/>
+                              <w:rPr>
+                                <w:noProof/>
+                              </w:rPr>
+                            </w:pPr>
+                            <w:r>
+                              <w:rPr>
+                                <w:rFonts w:ascii="Times New Roman" w:hAnsi="Times New Roman"/>
+                                <w:w w:val="111"/>
+                                <w:kern w:val="0"/>
+                                <w:sz w:val="18"/>
+                                <w:szCs w:val="18"/>
+                              </w:rPr>
+                              <w:t>A</w:t>
+                            </w:r>
+                            <w:r>
+                              <w:rPr>
+                                <w:rFonts w:ascii="Times New Roman" w:hAnsi="Times New Roman"/>
+                                <w:spacing w:val="1"/>
+                                <w:w w:val="111"/>
+                                <w:kern w:val="0"/>
+                                <w:sz w:val="18"/>
+                                <w:szCs w:val="18"/>
+                              </w:rPr>
+                              <w:t>pp</w:t>
+                            </w:r>
+                            <w:r>
+                              <w:rPr>
+                                <w:rFonts w:ascii="Times New Roman" w:hAnsi="Times New Roman"/>
+                                <w:spacing w:val="-1"/>
+                                <w:w w:val="111"/>
+                                <w:kern w:val="0"/>
+                                <w:sz w:val="18"/>
+                                <w:szCs w:val="18"/>
+                              </w:rPr>
+                              <w:t>l</w:t>
+                            </w:r>
+                            <w:r>
+                              <w:rPr>
+                                <w:rFonts w:ascii="Times New Roman" w:hAnsi="Times New Roman"/>
+                                <w:spacing w:val="1"/>
+                                <w:w w:val="111"/>
+                                <w:kern w:val="0"/>
+                                <w:sz w:val="18"/>
+                                <w:szCs w:val="18"/>
+                              </w:rPr>
+                              <w:t>ic</w:t>
+                            </w:r>
+                            <w:r>
+                              <w:rPr>
+                                <w:rFonts w:ascii="Times New Roman" w:hAnsi="Times New Roman"/>
+                                <w:w w:val="111"/>
+                                <w:kern w:val="0"/>
+                                <w:sz w:val="18"/>
+                                <w:szCs w:val="18"/>
+                              </w:rPr>
+                              <w:t>a</w:t>
+                            </w:r>
+                            <w:r>
+                              <w:rPr>
+                                <w:rFonts w:ascii="Times New Roman" w:hAnsi="Times New Roman"/>
+                                <w:spacing w:val="1"/>
+                                <w:w w:val="111"/>
+                                <w:kern w:val="0"/>
+                                <w:sz w:val="18"/>
+                                <w:szCs w:val="18"/>
+                              </w:rPr>
+                              <w:t>n</w:t>
+                            </w:r>
+                            <w:r>
+                              <w:rPr>
+                                <w:rFonts w:ascii="Times New Roman" w:hAnsi="Times New Roman"/>
+                                <w:w w:val="111"/>
+                                <w:kern w:val="0"/>
+                                <w:sz w:val="18"/>
+                                <w:szCs w:val="18"/>
+                              </w:rPr>
+                              <w:t>t</w:t>
+                            </w:r>
+                            <w:r>
+                              <w:rPr>
+                                <w:rFonts w:ascii="Times New Roman" w:hAnsi="Times New Roman"/>
+                                <w:spacing w:val="-5"/>
+                                <w:w w:val="111"/>
+                                <w:kern w:val="0"/>
+                                <w:sz w:val="18"/>
+                                <w:szCs w:val="18"/>
+                              </w:rPr>
+                              <w:t xml:space="preserve"> </w:t>
+                            </w:r>
+                            <w:r>
+                              <w:rPr>
+                                <w:rFonts w:ascii="Times New Roman" w:hAnsi="Times New Roman"/>
+                                <w:spacing w:val="1"/>
+                                <w:w w:val="111"/>
+                                <w:kern w:val="0"/>
+                                <w:sz w:val="18"/>
+                                <w:szCs w:val="18"/>
+                              </w:rPr>
+                              <w:t>S</w:t>
+                            </w:r>
+                            <w:r>
+                              <w:rPr>
+                                <w:rFonts w:ascii="Times New Roman" w:hAnsi="Times New Roman"/>
+                                <w:spacing w:val="-1"/>
+                                <w:w w:val="111"/>
+                                <w:kern w:val="0"/>
+                                <w:sz w:val="18"/>
+                                <w:szCs w:val="18"/>
+                              </w:rPr>
+                              <w:t>i</w:t>
+                            </w:r>
+                            <w:r>
+                              <w:rPr>
+                                <w:rFonts w:ascii="Times New Roman" w:hAnsi="Times New Roman"/>
+                                <w:spacing w:val="2"/>
+                                <w:w w:val="111"/>
+                                <w:kern w:val="0"/>
+                                <w:sz w:val="18"/>
+                                <w:szCs w:val="18"/>
+                              </w:rPr>
+                              <w:t>g</w:t>
+                            </w:r>
+                            <w:r>
+                              <w:rPr>
+                                <w:rFonts w:ascii="Times New Roman" w:hAnsi="Times New Roman"/>
+                                <w:spacing w:val="-1"/>
+                                <w:w w:val="111"/>
+                                <w:kern w:val="0"/>
+                                <w:sz w:val="18"/>
+                                <w:szCs w:val="18"/>
+                              </w:rPr>
+                              <w:t>n</w:t>
+                            </w:r>
+                            <w:r>
+                              <w:rPr>
+                                <w:rFonts w:ascii="Times New Roman" w:hAnsi="Times New Roman"/>
+                                <w:spacing w:val="4"/>
+                                <w:w w:val="111"/>
+                                <w:kern w:val="0"/>
+                                <w:sz w:val="18"/>
+                                <w:szCs w:val="18"/>
+                              </w:rPr>
+                              <w:t>a</w:t>
+                            </w:r>
+                            <w:r>
+                              <w:rPr>
+                                <w:rFonts w:ascii="Times New Roman" w:hAnsi="Times New Roman"/>
+                                <w:spacing w:val="-1"/>
+                                <w:w w:val="111"/>
+                                <w:kern w:val="0"/>
+                                <w:sz w:val="18"/>
+                                <w:szCs w:val="18"/>
+                              </w:rPr>
+                              <w:t>tu</w:t>
+                            </w:r>
+                            <w:r>
+                              <w:rPr>
+                                <w:rFonts w:ascii="Times New Roman" w:hAnsi="Times New Roman"/>
+                                <w:spacing w:val="1"/>
+                                <w:w w:val="111"/>
+                                <w:kern w:val="0"/>
+                                <w:sz w:val="18"/>
+                                <w:szCs w:val="18"/>
+                              </w:rPr>
+                              <w:t>r</w:t>
+                            </w:r>
+                            <w:r>
+                              <w:rPr>
+                                <w:rFonts w:ascii="Times New Roman" w:hAnsi="Times New Roman"/>
+                                <w:w w:val="111"/>
+                                <w:kern w:val="0"/>
+                                <w:sz w:val="18"/>
+                                <w:szCs w:val="18"/>
+                              </w:rPr>
+                              <w:t>e</w:t>
+                            </w:r>
+                            <w:r>
+                              <w:rPr>
+                                <w:rFonts w:ascii="Times New Roman" w:hAnsi="Times New Roman"/>
+                                <w:spacing w:val="9"/>
+                                <w:w w:val="111"/>
+                                <w:kern w:val="0"/>
+                                <w:sz w:val="18"/>
+                                <w:szCs w:val="18"/>
+                              </w:rPr>
+                              <w:t xml:space="preserve"> </w:t>
+                            </w:r>
+                            <w:r>
+                              <w:rPr>
+                                <w:rFonts w:ascii="Times New Roman" w:hAnsi="Times New Roman"/>
+                                <w:w w:val="103"/>
+                                <w:kern w:val="0"/>
+                                <w:sz w:val="18"/>
+                                <w:szCs w:val="18"/>
+                              </w:rPr>
+                              <w:t>o</w:t>
+                            </w:r>
+                            <w:r>
+                              <w:rPr>
+                                <w:rFonts w:ascii="Times New Roman" w:hAnsi="Times New Roman"/>
+                                <w:spacing w:val="2"/>
+                                <w:w w:val="103"/>
+                                <w:kern w:val="0"/>
+                                <w:sz w:val="18"/>
+                                <w:szCs w:val="18"/>
+                              </w:rPr>
+                              <w:t>v</w:t>
+                            </w:r>
+                            <w:r>
+                              <w:rPr>
+                                <w:rFonts w:ascii="Times New Roman" w:hAnsi="Times New Roman"/>
+                                <w:spacing w:val="-1"/>
+                                <w:w w:val="103"/>
+                                <w:kern w:val="0"/>
+                                <w:sz w:val="18"/>
+                                <w:szCs w:val="18"/>
+                              </w:rPr>
+                              <w:t>e</w:t>
+                            </w:r>
+                            <w:r>
+                              <w:rPr>
+                                <w:rFonts w:ascii="Times New Roman" w:hAnsi="Times New Roman"/>
+                                <w:w w:val="138"/>
+                                <w:kern w:val="0"/>
+                                <w:sz w:val="18"/>
+                                <w:szCs w:val="18"/>
+                              </w:rPr>
+                              <w:t>r</w:t>
+                            </w:r>
+                            <w:r>
+                              <w:rPr>
+                                <w:rFonts w:ascii="Times New Roman" w:hAnsi="Times New Roman"/>
+                                <w:spacing w:val="3"/>
+                                <w:kern w:val="0"/>
+                                <w:sz w:val="18"/>
+                                <w:szCs w:val="18"/>
+                              </w:rPr>
+                              <w:t xml:space="preserve"> </w:t>
+                            </w:r>
+                            <w:r>
+                              <w:rPr>
+                                <w:rFonts w:ascii="Times New Roman" w:hAnsi="Times New Roman"/>
+                                <w:spacing w:val="2"/>
+                                <w:w w:val="115"/>
+                                <w:kern w:val="0"/>
+                                <w:sz w:val="18"/>
+                                <w:szCs w:val="18"/>
+                              </w:rPr>
+                              <w:t>P</w:t>
+                            </w:r>
+                            <w:r>
+                              <w:rPr>
+                                <w:rFonts w:ascii="Times New Roman" w:hAnsi="Times New Roman"/>
+                                <w:spacing w:val="1"/>
+                                <w:w w:val="115"/>
+                                <w:kern w:val="0"/>
+                                <w:sz w:val="18"/>
+                                <w:szCs w:val="18"/>
+                              </w:rPr>
+                              <w:t>r</w:t>
+                            </w:r>
+                            <w:r>
+                              <w:rPr>
+                                <w:rFonts w:ascii="Times New Roman" w:hAnsi="Times New Roman"/>
+                                <w:spacing w:val="-1"/>
+                                <w:w w:val="115"/>
+                                <w:kern w:val="0"/>
+                                <w:sz w:val="18"/>
+                                <w:szCs w:val="18"/>
+                              </w:rPr>
+                              <w:t>in</w:t>
+                            </w:r>
+                            <w:r>
+                              <w:rPr>
+                                <w:rFonts w:ascii="Times New Roman" w:hAnsi="Times New Roman"/>
+                                <w:spacing w:val="3"/>
+                                <w:w w:val="115"/>
+                                <w:kern w:val="0"/>
+                                <w:sz w:val="18"/>
+                                <w:szCs w:val="18"/>
+                              </w:rPr>
+                              <w:t>t</w:t>
+                            </w:r>
+                            <w:r>
+                              <w:rPr>
+                                <w:rFonts w:ascii="Times New Roman" w:hAnsi="Times New Roman"/>
+                                <w:spacing w:val="1"/>
+                                <w:w w:val="115"/>
+                                <w:kern w:val="0"/>
+                                <w:sz w:val="18"/>
+                                <w:szCs w:val="18"/>
+                              </w:rPr>
+                              <w:t>e</w:t>
+                            </w:r>
+                            <w:r>
+                              <w:rPr>
+                                <w:rFonts w:ascii="Times New Roman" w:hAnsi="Times New Roman"/>
+                                <w:w w:val="115"/>
+                                <w:kern w:val="0"/>
+                                <w:sz w:val="18"/>
+                                <w:szCs w:val="18"/>
+                              </w:rPr>
+                              <w:t>d</w:t>
+                            </w:r>
+                            <w:r>
+                              <w:rPr>
+                                <w:rFonts w:ascii="Times New Roman" w:hAnsi="Times New Roman"/>
+                                <w:spacing w:val="-8"/>
+                                <w:w w:val="115"/>
+                                <w:kern w:val="0"/>
+                                <w:sz w:val="18"/>
+                                <w:szCs w:val="18"/>
+                              </w:rPr>
+                              <w:t xml:space="preserve"> </w:t>
+                            </w:r>
+                            <w:r>
+                              <w:rPr>
+                                <w:rFonts w:ascii="Times New Roman" w:hAnsi="Times New Roman"/>
+                                <w:spacing w:val="3"/>
+                                <w:w w:val="103"/>
+                                <w:kern w:val="0"/>
+                                <w:sz w:val="18"/>
+                                <w:szCs w:val="18"/>
+                              </w:rPr>
+                              <w:t>N</w:t>
+                            </w:r>
+                            <w:r>
+                              <w:rPr>
+                                <w:rFonts w:ascii="Times New Roman" w:hAnsi="Times New Roman"/>
+                                <w:w w:val="117"/>
+                                <w:kern w:val="0"/>
+                                <w:sz w:val="18"/>
+                                <w:szCs w:val="18"/>
+                              </w:rPr>
+                              <w:t>a</w:t>
+                            </w:r>
+                            <w:r>
+                              <w:rPr>
+                                <w:rFonts w:ascii="Times New Roman" w:hAnsi="Times New Roman"/>
+                                <w:spacing w:val="1"/>
+                                <w:w w:val="111"/>
+                                <w:kern w:val="0"/>
+                                <w:sz w:val="18"/>
+                                <w:szCs w:val="18"/>
+                              </w:rPr>
+                              <w:t>m</w:t>
+                            </w:r>
+                            <w:r>
+                              <w:rPr>
+                                <w:rFonts w:ascii="Times New Roman" w:hAnsi="Times New Roman"/>
+                                <w:w w:val="103"/>
+                                <w:kern w:val="0"/>
+                                <w:sz w:val="18"/>
+                                <w:szCs w:val="18"/>
+                              </w:rPr>
+                              <w:t>e</w:t>
+                            </w:r>
+                          </w:p>
+                          <w:p/>
+                        </w:txbxContent>
+                      </wps:txbx>
+                      <wps:bodyPr rot="0" spcFirstLastPara="0" vertOverflow="overflow" horzOverflow="overflow" vert="horz" wrap="square" lIns="91440" tIns="45720" rIns="91440" bIns="45720" numCol="1" spcCol="0" rtlCol="0" fromWordArt="0" anchor="t" anchorCtr="0" forceAA="0" compatLnSpc="1">
+                        <a:prstTxWarp prst="textNoShape">
+                          <a:avLst/>
+                        </a:prstTxWarp>
+                        <a:noAutofit/>
+                      </wps:bodyPr>
+                    </wps:wsp>
+                  </a:graphicData>
+                </a:graphic>
+                <wp14:sizeRelH relativeFrom="margin">
+                  <wp14:pctWidth>0</wp14:pctWidth>
+                </wp14:sizeRelH>
+                <wp14:sizeRelV relativeFrom="margin">
+                  <wp14:pctHeight>0</wp14:pctHeight>
+                </wp14:sizeRelV>
+              </wp:anchor>
+            </w:drawing>
+          </mc:Choice>
+          <mc:Fallback>
+            <w:pict>
+              <v:shape w14:anchorId="6AB430F5" id="Text Box 34" o:spid="_x0000_s1027" type="#_x0000_t202" style="position:absolute;margin-left:-57.65pt;margin-top:705pt;width:195.1pt;height:20.4pt;z-index:251674624;visibility:visible;mso-wrap-style:square;mso-width-percent:0;mso-height-percent:0;mso-wrap-distance-left:9pt;mso-wrap-distance-top:0;mso-wrap-distance-right:9pt;mso-wrap-distance-bottom:0;mso-position-horizontal:absolute;mso-position-horizontal-relative:text;mso-position-vertical:absolute;mso-position-vertical-relative:text;mso-width-percent:0;mso-height-percent:0;mso-width-relative:margin;mso-height-relative:margin;v-text-anchor:top" o:gfxdata="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" fillcolor="white [3201]" stroked="f" strokeweight=".5pt">
+                <v:textbox>
+                  <w:txbxContent>
+                    <w:p>
+                      <w:pPr>
+                        <w:widowControl w:val="0"/>
+                        <w:autoSpaceDE w:val="0"/>
+                        <w:spacing w:after="0" w:line="240" w:lineRule="auto"/>
+                        <w:ind w:left="118"/>
+                        <w:rPr>
+                          <w:noProof/>
+                        </w:rPr>
+                      </w:pPr>
+                      <w:r>
+                        <w:rPr>
+                          <w:rFonts w:ascii="Times New Roman" w:hAnsi="Times New Roman"/>
+                          <w:w w:val="111"/>
+                          <w:kern w:val="0"/>
+                          <w:sz w:val="18"/>
+                          <w:szCs w:val="18"/>
+                        </w:rPr>
+                        <w:t>A</w:t>
+                      </w:r>
+                      <w:r>
+                        <w:rPr>
+                          <w:rFonts w:ascii="Times New Roman" w:hAnsi="Times New Roman"/>
+                          <w:spacing w:val="1"/>
+                          <w:w w:val="111"/>
+                          <w:kern w:val="0"/>
+                          <w:sz w:val="18"/>
+                          <w:szCs w:val="18"/>
+                        </w:rPr>
+                        <w:t>pp</w:t>
+                      </w:r>
+                      <w:r>
+                        <w:rPr>
+                          <w:rFonts w:ascii="Times New Roman" w:hAnsi="Times New Roman"/>
+                          <w:spacing w:val="-1"/>
+                          <w:w w:val="111"/>
+                          <w:kern w:val="0"/>
+                          <w:sz w:val="18"/>
+                          <w:szCs w:val="18"/>
+                        </w:rPr>
+                        <w:t>l</w:t>
+                      </w:r>
+                      <w:r>
+                        <w:rPr>
+                          <w:rFonts w:ascii="Times New Roman" w:hAnsi="Times New Roman"/>
+                          <w:spacing w:val="1"/>
+                          <w:w w:val="111"/>
+                          <w:kern w:val="0"/>
+                          <w:sz w:val="18"/>
+                          <w:szCs w:val="18"/>
+                        </w:rPr>
+                        <w:t>ic</w:t>
+                      </w:r>
+                      <w:r>
+                        <w:rPr>
+                          <w:rFonts w:ascii="Times New Roman" w:hAnsi="Times New Roman"/>
+                          <w:w w:val="111"/>
+                          <w:kern w:val="0"/>
+                          <w:sz w:val="18"/>
+                          <w:szCs w:val="18"/>
+                        </w:rPr>
+                        <w:t>a</w:t>
+                      </w:r>
+                      <w:r>
+                        <w:rPr>
+                          <w:rFonts w:ascii="Times New Roman" w:hAnsi="Times New Roman"/>
+                          <w:spacing w:val="1"/>
+                          <w:w w:val="111"/>
+                          <w:kern w:val="0"/>
+                          <w:sz w:val="18"/>
+                          <w:szCs w:val="18"/>
+                        </w:rPr>
+                        <w:t>n</w:t>
+                      </w:r>
+                      <w:r>
+                        <w:rPr>
+                          <w:rFonts w:ascii="Times New Roman" w:hAnsi="Times New Roman"/>
+                          <w:w w:val="111"/>
+                          <w:kern w:val="0"/>
+                          <w:sz w:val="18"/>
+                          <w:szCs w:val="18"/>
+                        </w:rPr>
+                        <w:t>t</w:t>
+                      </w:r>
+                      <w:r>
+                        <w:rPr>
+                          <w:rFonts w:ascii="Times New Roman" w:hAnsi="Times New Roman"/>
+                          <w:spacing w:val="-5"/>
+                          <w:w w:val="111"/>
+                          <w:kern w:val="0"/>
+                          <w:sz w:val="18"/>
+                          <w:szCs w:val="18"/>
+                        </w:rPr>
+                        <w:t xml:space="preserve"> </w:t>
+                      </w:r>
+                      <w:r>
+                        <w:rPr>
+                          <w:rFonts w:ascii="Times New Roman" w:hAnsi="Times New Roman"/>
+                          <w:spacing w:val="1"/>
+                          <w:w w:val="111"/>
+                          <w:kern w:val="0"/>
+                          <w:sz w:val="18"/>
+                          <w:szCs w:val="18"/>
+                        </w:rPr>
+                        <w:t>S</w:t>
+                      </w:r>
+                      <w:r>
+                        <w:rPr>
+                          <w:rFonts w:ascii="Times New Roman" w:hAnsi="Times New Roman"/>
+                          <w:spacing w:val="-1"/>
+                          <w:w w:val="111"/>
+                          <w:kern w:val="0"/>
+                          <w:sz w:val="18"/>
+                          <w:szCs w:val="18"/>
+                        </w:rPr>
+                        <w:t>i</w:t>
+                      </w:r>
+                      <w:r>
+                        <w:rPr>
+                          <w:rFonts w:ascii="Times New Roman" w:hAnsi="Times New Roman"/>
+                          <w:spacing w:val="2"/>
+                          <w:w w:val="111"/>
+                          <w:kern w:val="0"/>
+                          <w:sz w:val="18"/>
+                          <w:szCs w:val="18"/>
+                        </w:rPr>
+                        <w:t>g</w:t>
+                      </w:r>
+                      <w:r>
+                        <w:rPr>
+                          <w:rFonts w:ascii="Times New Roman" w:hAnsi="Times New Roman"/>
+                          <w:spacing w:val="-1"/>
+                          <w:w w:val="111"/>
+                          <w:kern w:val="0"/>
+                          <w:sz w:val="18"/>
+                          <w:szCs w:val="18"/>
+                        </w:rPr>
+                        <w:t>n</w:t>
+                      </w:r>
+                      <w:r>
+                        <w:rPr>
+                          <w:rFonts w:ascii="Times New Roman" w:hAnsi="Times New Roman"/>
+                          <w:spacing w:val="4"/>
+                          <w:w w:val="111"/>
+                          <w:kern w:val="0"/>
+                          <w:sz w:val="18"/>
+                          <w:szCs w:val="18"/>
+                        </w:rPr>
+                        <w:t>a</w:t>
+                      </w:r>
+                      <w:r>
+                        <w:rPr>
+                          <w:rFonts w:ascii="Times New Roman" w:hAnsi="Times New Roman"/>
+                          <w:spacing w:val="-1"/>
+                          <w:w w:val="111"/>
+                          <w:kern w:val="0"/>
+                          <w:sz w:val="18"/>
+                          <w:szCs w:val="18"/>
+                        </w:rPr>
+                        <w:t>tu</w:t>
+                      </w:r>
+                      <w:r>
+                        <w:rPr>
+                          <w:rFonts w:ascii="Times New Roman" w:hAnsi="Times New Roman"/>
+                          <w:spacing w:val="1"/>
+                          <w:w w:val="111"/>
+                          <w:kern w:val="0"/>
+                          <w:sz w:val="18"/>
+                          <w:szCs w:val="18"/>
+                        </w:rPr>
+                        <w:t>r</w:t>
+                      </w:r>
+                      <w:r>
+                        <w:rPr>
+                          <w:rFonts w:ascii="Times New Roman" w:hAnsi="Times New Roman"/>
+                          <w:w w:val="111"/>
+                          <w:kern w:val="0"/>
+                          <w:sz w:val="18"/>
+                          <w:szCs w:val="18"/>
+                        </w:rPr>
+                        <w:t>e</w:t>
+                      </w:r>
+                      <w:r>
+                        <w:rPr>
+                          <w:rFonts w:ascii="Times New Roman" w:hAnsi="Times New Roman"/>
+                          <w:spacing w:val="9"/>
+                          <w:w w:val="111"/>
+                          <w:kern w:val="0"/>
+                          <w:sz w:val="18"/>
+                          <w:szCs w:val="18"/>
+                        </w:rPr>
+                        <w:t xml:space="preserve"> </w:t>
+                      </w:r>
+                      <w:r>
+                        <w:rPr>
+                          <w:rFonts w:ascii="Times New Roman" w:hAnsi="Times New Roman"/>
+                          <w:w w:val="103"/>
+                          <w:kern w:val="0"/>
+                          <w:sz w:val="18"/>
+                          <w:szCs w:val="18"/>
+                        </w:rPr>
+                        <w:t>o</w:t>
+                      </w:r>
+                      <w:r>
+                        <w:rPr>
+                          <w:rFonts w:ascii="Times New Roman" w:hAnsi="Times New Roman"/>
+                          <w:spacing w:val="2"/>
+                          <w:w w:val="103"/>
+                          <w:kern w:val="0"/>
+                          <w:sz w:val="18"/>
+                          <w:szCs w:val="18"/>
+                        </w:rPr>
+                        <w:t>v</w:t>
+                      </w:r>
+                      <w:r>
+                        <w:rPr>
+                          <w:rFonts w:ascii="Times New Roman" w:hAnsi="Times New Roman"/>
+                          <w:spacing w:val="-1"/>
+                          <w:w w:val="103"/>
+                          <w:kern w:val="0"/>
+                          <w:sz w:val="18"/>
+                          <w:szCs w:val="18"/>
+                        </w:rPr>
+                        <w:t>e</w:t>
+                      </w:r>
+                      <w:r>
+                        <w:rPr>
+                          <w:rFonts w:ascii="Times New Roman" w:hAnsi="Times New Roman"/>
+                          <w:w w:val="138"/>
+                          <w:kern w:val="0"/>
+                          <w:sz w:val="18"/>
+                          <w:szCs w:val="18"/>
+                        </w:rPr>
+                        <w:t>r</w:t>
+                      </w:r>
+                      <w:r>
+                        <w:rPr>
+                          <w:rFonts w:ascii="Times New Roman" w:hAnsi="Times New Roman"/>
+                          <w:spacing w:val="3"/>
+                          <w:kern w:val="0"/>
+                          <w:sz w:val="18"/>
+                          <w:szCs w:val="18"/>
+                        </w:rPr>
+                        <w:t xml:space="preserve"> </w:t>
+                      </w:r>
+                      <w:r>
+                        <w:rPr>
+                          <w:rFonts w:ascii="Times New Roman" w:hAnsi="Times New Roman"/>
+                          <w:spacing w:val="2"/>
+                          <w:w w:val="115"/>
+                          <w:kern w:val="0"/>
+                          <w:sz w:val="18"/>
+                          <w:szCs w:val="18"/>
+                        </w:rPr>
+                        <w:t>P</w:t>
+                      </w:r>
+                      <w:r>
+                        <w:rPr>
+                          <w:rFonts w:ascii="Times New Roman" w:hAnsi="Times New Roman"/>
+                          <w:spacing w:val="1"/>
+                          <w:w w:val="115"/>
+                          <w:kern w:val="0"/>
+                          <w:sz w:val="18"/>
+                          <w:szCs w:val="18"/>
+                        </w:rPr>
+                        <w:t>r</w:t>
+                      </w:r>
+                      <w:r>
+                        <w:rPr>
+                          <w:rFonts w:ascii="Times New Roman" w:hAnsi="Times New Roman"/>
+                          <w:spacing w:val="-1"/>
+                          <w:w w:val="115"/>
+                          <w:kern w:val="0"/>
+                          <w:sz w:val="18"/>
+                          <w:szCs w:val="18"/>
+                        </w:rPr>
+                        <w:t>in</w:t>
+                      </w:r>
+                      <w:r>
+                        <w:rPr>
+                          <w:rFonts w:ascii="Times New Roman" w:hAnsi="Times New Roman"/>
+                          <w:spacing w:val="3"/>
+                          <w:w w:val="115"/>
+                          <w:kern w:val="0"/>
+                          <w:sz w:val="18"/>
+                          <w:szCs w:val="18"/>
+                        </w:rPr>
+                        <w:t>t</w:t>
+                      </w:r>
+                      <w:r>
+                        <w:rPr>
+                          <w:rFonts w:ascii="Times New Roman" w:hAnsi="Times New Roman"/>
+                          <w:spacing w:val="1"/>
+                          <w:w w:val="115"/>
+                          <w:kern w:val="0"/>
+                          <w:sz w:val="18"/>
+                          <w:szCs w:val="18"/>
+                        </w:rPr>
+                        <w:t>e</w:t>
+                      </w:r>
+                      <w:r>
+                        <w:rPr>
+                          <w:rFonts w:ascii="Times New Roman" w:hAnsi="Times New Roman"/>
+                          <w:w w:val="115"/>
+                          <w:kern w:val="0"/>
+                          <w:sz w:val="18"/>
+                          <w:szCs w:val="18"/>
+                        </w:rPr>
+                        <w:t>d</w:t>
+                      </w:r>
+                      <w:r>
+                        <w:rPr>
+                          <w:rFonts w:ascii="Times New Roman" w:hAnsi="Times New Roman"/>
+                          <w:spacing w:val="-8"/>
+                          <w:w w:val="115"/>
+                          <w:kern w:val="0"/>
+                          <w:sz w:val="18"/>
+                          <w:szCs w:val="18"/>
+                        </w:rPr>
+                        <w:t xml:space="preserve"> </w:t>
+                      </w:r>
+                      <w:r>
+                        <w:rPr>
+                          <w:rFonts w:ascii="Times New Roman" w:hAnsi="Times New Roman"/>
+                          <w:spacing w:val="3"/>
+                          <w:w w:val="103"/>
+                          <w:kern w:val="0"/>
+                          <w:sz w:val="18"/>
+                          <w:szCs w:val="18"/>
+                        </w:rPr>
+                        <w:t>N</w:t>
+                      </w:r>
+                      <w:r>
+                        <w:rPr>
+                          <w:rFonts w:ascii="Times New Roman" w:hAnsi="Times New Roman"/>
+                          <w:w w:val="117"/>
+                          <w:kern w:val="0"/>
+                          <w:sz w:val="18"/>
+                          <w:szCs w:val="18"/>
+                        </w:rPr>
+                        <w:t>a</w:t>
+                      </w:r>
+                      <w:r>
+                        <w:rPr>
+                          <w:rFonts w:ascii="Times New Roman" w:hAnsi="Times New Roman"/>
+                          <w:spacing w:val="1"/>
+                          <w:w w:val="111"/>
+                          <w:kern w:val="0"/>
+                          <w:sz w:val="18"/>
+                          <w:szCs w:val="18"/>
+                        </w:rPr>
+                        <w:t>m</w:t>
+                      </w:r>
+                      <w:r>
+                        <w:rPr>
+                          <w:rFonts w:ascii="Times New Roman" w:hAnsi="Times New Roman"/>
+                          <w:w w:val="103"/>
+                          <w:kern w:val="0"/>
+                          <w:sz w:val="18"/>
+                          <w:szCs w:val="18"/>
+                        </w:rPr>
+                        <w:t>e</w:t>
+                      </w:r>
+                    </w:p>
+                    <w:p/>
+                  </w:txbxContent>
+                </v:textbox>
+              </v:shape>
+            </w:pict>
+          </mc:Fallback>
+        </mc:AlternateContent>
+      </w:r>
+      <w:r>
+        <w:rPr>
+          <w:noProof/>
+        </w:rPr>
+        <mc:AlternateContent>
+          <mc:Choice Requires="wps">
+            <w:drawing>
+              <wp:anchor distT="0" distB="0" distL="114300" distR="114300" simplePos="0" relativeHeight="251676672" behindDoc="0" locked="0" layoutInCell="1" allowOverlap="1" wp14:anchorId="5A0BFA9D" wp14:editId="38CD4256">
+                <wp:simplePos x="0" y="0"/>
+                <wp:positionH relativeFrom="column">
+                  <wp:posOffset>-559617</wp:posOffset>
+                </wp:positionH>
+                <wp:positionV relativeFrom="paragraph">
+                  <wp:posOffset>8988244</wp:posOffset>
+                </wp:positionV>
+                <wp:extent cx="2000250" cy="0"/>
+                <wp:effectExtent l="0" t="0" r="0" b="0"/>
+                <wp:wrapNone/>
+                <wp:docPr id="578890046" name="Straight Connector 31"/>
+                <wp:cNvGraphicFramePr/>
+                <a:graphic xmlns:a="http://schemas.openxmlformats.org/drawingml/2006/main">
+                  <a:graphicData uri="http://schemas.microsoft.com/office/word/2010/wordprocessingShape">
+                    <wps:wsp>
+                      <wps:cNvCnPr/>
+                      <wps:spPr>
+                        <a:xfrm flipV="1">
+                          <a:off x="0" y="0"/>
+                          <a:ext cx="2000250" cy="0"/>
+                        </a:xfrm>
+                        <a:prstGeom prst="line">
+                          <a:avLst/>
+                        </a:prstGeom>
+                        <a:ln w="12700">
+                          <a:solidFill>
+                            <a:schemeClr val="tx1"/>
+                          </a:solidFill>
+                        </a:ln>
+                      </wps:spPr>
+                      <wps:style>
+                        <a:lnRef idx="1">
+                          <a:schemeClr val="accent1"/>
+                        </a:lnRef>
+                        <a:fillRef idx="0">
+                          <a:schemeClr val="accent1"/>
+                        </a:fillRef>
+                        <a:effectRef idx="0">
+                          <a:schemeClr val="accent1"/>
+                        </a:effectRef>
+                        <a:fontRef idx="minor">
+                          <a:schemeClr val="tx1"/>
+                        </a:fontRef>
+                      </wps:style>
+                      <wps:bodyPr/>
+                    </wps:wsp>
+                  </a:graphicData>
+                </a:graphic>
+                <wp14:sizeRelH relativeFrom="margin">
+                  <wp14:pctWidth>0</wp14:pctWidth>
+                </wp14:sizeRelH>
+                <wp14:sizeRelV relativeFrom="margin">
+                  <wp14:pctHeight>0</wp14:pctHeight>
+                </wp14:sizeRelV>
+              </wp:anchor>
+            </w:drawing>
+          </mc:Choice>
+          <mc:Fallback>
+            <w:pict>
+              <v:line w14:anchorId="3C8612DC" id="Straight Connector 31" o:spid="_x0000_s1026" style="position:absolute;flip:y;z-index:251676672;visibility:visible;mso-wrap-style:square;mso-width-percent:0;mso-height-percent:0;mso-wrap-distance-left:9pt;mso-wrap-distance-top:0;mso-wrap-distance-right:9pt;mso-wrap-distance-bottom:0;mso-position-horizontal:absolute;mso-position-horizontal-relative:text;mso-position-vertical:absolute;mso-position-vertical-relative:text;mso-width-percent:0;mso-height-percent:0;mso-width-relative:margin;mso-height-relative:margin" from="-44.05pt,707.75pt" to="113.45pt,707.75pt" o:gfxdata="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" strokecolor="black [3213]" strokeweight="1pt">
+                <v:stroke joinstyle="miter"/>
+              </v:line>
+            </w:pict>
+          </mc:Fallback>
+        </mc:AlternateContent>
+      </w:r>
+      <w:r>
+        <w:rPr>
+          <w:noProof/>
+        </w:rPr>
+        <mc:AlternateContent>
+          <mc:Choice Requires="wps">
+            <w:drawing>
+              <wp:anchor distT="0" distB="0" distL="114300" distR="114300" simplePos="0" relativeHeight="251687936" behindDoc="1" locked="0" layoutInCell="1" allowOverlap="1" wp14:anchorId="251F9A15" wp14:editId="1B413276">
+                <wp:simplePos x="0" y="0"/>
+                <wp:positionH relativeFrom="page">
+                  <wp:posOffset>311785</wp:posOffset>
+                </wp:positionH>
+                <wp:positionV relativeFrom="paragraph">
+                  <wp:posOffset>8751026</wp:posOffset>
+                </wp:positionV>
+                <wp:extent cx="914400" cy="323850"/>
+                <wp:effectExtent l="0" t="0" r="0" b="0"/>
+                <wp:wrapNone/>
+                <wp:docPr id="379931101" name="Text Box 2" descr="Applicant Name"/>
+                <wp:cNvGraphicFramePr/>
+                <a:graphic xmlns:a="http://schemas.openxmlformats.org/drawingml/2006/main">
+                  <a:graphicData uri="http://schemas.microsoft.com/office/word/2010/wordprocessingShape">
+                    <wps:wsp>
+                      <wps:cNvSpPr txBox="1"/>
+                      <wps:spPr>
+                        <a:xfrm>
+                          <a:off x="0" y="0"/>
+                          <a:ext cx="914400" cy="323850"/>
+                        </a:xfrm>
+                        <a:prstGeom prst="rect">
+                          <a:avLst/>
+                        </a:prstGeom>
+                        <a:solidFill>
+                          <a:schemeClr val="lt1"/>
+                        </a:solidFill>
+                        <a:ln w="6350">
+                          <a:noFill/>
+                        </a:ln>
+                      </wps:spPr>
+                      <wps:txbx>
+                        <w:txbxContent>
+                          <w:p>
+                            <w:r>
+                              <w:t>APPLICANT NAME PLACEHOLDER</w:t>
+                            </w:r>
+                          </w:p>
+                        </w:txbxContent>
+                      </wps:txbx>
+                      <wps:bodyPr rot="0" spcFirstLastPara="0" vertOverflow="overflow" horzOverflow="overflow" vert="horz" wrap="none" lIns="91440" tIns="45720" rIns="91440" bIns="45720" numCol="1" spcCol="0" rtlCol="0" fromWordArt="0" anchor="t" anchorCtr="0" forceAA="0" compatLnSpc="1">
+                        <a:noAutofit/>
+                      </wps:bodyPr>
+                    </wps:wsp>
+                  </a:graphicData>
+                </a:graphic>
+              </wp:anchor>
+            </w:drawing>
+          </mc:Choice>
+          <mc:Fallback>
+            <w:pict>
+              <v:shape w14:anchorId="251F9A15" id="Text Box 2" o:spid="_x0000_s1028" type="#_x0000_t202" alt="Applicant Name" style="position:absolute;margin-left:24.55pt;margin-top:689.05pt;width:1in;height:25.5pt;z-index:-251628544;visibility:visible;mso-wrap-style:none;mso-wrap-distance-left:9pt;mso-wrap-distance-top:0;mso-wrap-distance-right:9pt;mso-wrap-distance-bottom:0;mso-position-horizontal:absolute;mso-position-horizontal-relative:page;mso-position-vertical:absolute;mso-position-vertical-relative:text;v-text-anchor:top" o:gfxdata="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" fillcolor="white [3201]" stroked="f" strokeweight=".5pt">
+                <v:textbox>
+                  <w:txbxContent>
+                    <w:p>
+                      <w:r>
+                        <w:t>APPLICANT NAME PLACEHOLDER</w:t>
+                      </w:r>
+                    </w:p>
+                  </w:txbxContent>
+                </v:textbox>
+                <w10:wrap anchorx="page"/>
               </v:shape>
             </w:pict>
           </mc:Fallback>
@@ -678,7 +1436,7 @@
         <mc:AlternateContent>
           <mc:Choice Requires="wps">
             <w:drawing>
-              <wp:anchor distT="0" distB="0" distL="114300" distR="114300" simplePos="0" relativeHeight="251661312" behindDoc="0" locked="0" layoutInCell="1" allowOverlap="1" wp14:anchorId="27F7FDC4" wp14:editId="7DDFDCED">
+              <wp:anchor distT="0" distB="0" distL="114300" distR="114300" simplePos="0" relativeHeight="251661312" behindDoc="0" locked="0" layoutInCell="1" allowOverlap="1" wp14:anchorId="27F7FDC4" wp14:editId="2137CECB">
                 <wp:simplePos x="0" y="0"/>
                 <wp:positionH relativeFrom="page">
                   <wp:posOffset>2522220</wp:posOffset>
@@ -1329,7 +2087,7 @@
           </mc:Choice>
           <mc:Fallback>
             <w:pict>
-              <v:shape w14:anchorId="27F7FDC4" id="Text Box 39" o:spid="_x0000_s1027" type="#_x0000_t202" style="position:absolute;margin-left:198.6pt;margin-top:129.6pt;width:410.4pt;height:559.2pt;z-index:251661312;visibility:visible;mso-wrap-style:square;mso-width-percent:0;mso-height-percent:0;mso-wrap-distance-left:9pt;mso-wrap-distance-top:0;mso-wrap-distance-right:9pt;mso-wrap-distance-bottom:0;mso-position-horizontal:absolute;mso-position-horizontal-relative:page;mso-position-vertical:absolute;mso-position-vertical-relative:text;mso-width-percent:0;mso-height-percent:0;mso-width-relative:margin;mso-height-relative:margin;v-text-anchor:top" o:gfxdata="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" filled="f" stroked="f" strokeweight=".5pt">
+              <v:shape w14:anchorId="27F7FDC4" id="Text Box 39" o:spid="_x0000_s1029" type="#_x0000_t202" style="position:absolute;margin-left:198.6pt;margin-top:129.6pt;width:410.4pt;height:559.2pt;z-index:251661312;visibility:visible;mso-wrap-style:square;mso-width-percent:0;mso-height-percent:0;mso-wrap-distance-left:9pt;mso-wrap-distance-top:0;mso-wrap-distance-right:9pt;mso-wrap-distance-bottom:0;mso-position-horizontal:absolute;mso-position-horizontal-relative:page;mso-position-vertical:absolute;mso-position-vertical-relative:text;mso-width-percent:0;mso-height-percent:0;mso-width-relative:margin;mso-height-relative:margin;v-text-anchor:top" o:gfxdata="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" filled="f" stroked="f" strokeweight=".5pt">
                 <v:textbox>
                   <w:txbxContent>
                     <w:p>
@@ -1927,81 +2685,6 @@
                           <w:rFonts w:ascii="Times New Roman" w:hAnsi="Times New Roman"/>
                         </w:rPr>
                         <w:t>Punong Barangay</w:t>
-                      </w:r>
-                    </w:p>
-                  </w:txbxContent>
-                </v:textbox>
-                <w10:wrap anchorx="page"/>
-              </v:shape>
-            </w:pict>
-          </mc:Fallback>
-        </mc:AlternateContent>
-      </w:r>
-      <w:r>
-        <w:rPr>
-          <w:noProof/>
-        </w:rPr>
-        <mc:AlternateContent>
-          <mc:Choice Requires="wps">
-            <w:drawing>
-              <wp:anchor distT="0" distB="0" distL="114300" distR="114300" simplePos="0" relativeHeight="251687936" behindDoc="1" locked="0" layoutInCell="1" allowOverlap="1" wp14:anchorId="251F9A15" wp14:editId="6FBA082C">
-                <wp:simplePos x="0" y="0"/>
-                <wp:positionH relativeFrom="page">
-                  <wp:posOffset>235797</wp:posOffset>
-                </wp:positionH>
-                <wp:positionV relativeFrom="paragraph">
-                  <wp:posOffset>8839200</wp:posOffset>
-                </wp:positionV>
-                <wp:extent cx="914400" cy="323850"/>
-                <wp:effectExtent l="0" t="0" r="0" b="0"/>
-                <wp:wrapNone/>
-                <wp:docPr id="379931101" name="Text Box 2" descr="Applicant Name"/>
-                <wp:cNvGraphicFramePr/>
-                <a:graphic xmlns:a="http://schemas.openxmlformats.org/drawingml/2006/main">
-                  <a:graphicData uri="http://schemas.microsoft.com/office/word/2010/wordprocessingShape">
-                    <wps:wsp>
-                      <wps:cNvSpPr txBox="1"/>
-                      <wps:spPr>
-                        <a:xfrm>
-                          <a:off x="0" y="0"/>
-                          <a:ext cx="914400" cy="323850"/>
-                        </a:xfrm>
-                        <a:prstGeom prst="rect">
-                          <a:avLst/>
-                        </a:prstGeom>
-                        <a:solidFill>
-                          <a:schemeClr val="lt1"/>
-                        </a:solidFill>
-                        <a:ln w="6350">
-                          <a:noFill/>
-                        </a:ln>
-                      </wps:spPr>
-                      <wps:txbx>
-                        <w:txbxContent>
-                          <w:p>
-                            <w:r>
-                              <w:t>APPLICANT NAME PLACEHOLDER</w:t>
-                            </w:r>
-                          </w:p>
-                        </w:txbxContent>
-                      </wps:txbx>
-                      <wps:bodyPr rot="0" spcFirstLastPara="0" vertOverflow="overflow" horzOverflow="overflow" vert="horz" wrap="none" lIns="91440" tIns="45720" rIns="91440" bIns="45720" numCol="1" spcCol="0" rtlCol="0" fromWordArt="0" anchor="t" anchorCtr="0" forceAA="0" compatLnSpc="1">
-                        <a:noAutofit/>
-                      </wps:bodyPr>
-                    </wps:wsp>
-                  </a:graphicData>
-                </a:graphic>
-              </wp:anchor>
-            </w:drawing>
-          </mc:Choice>
-          <mc:Fallback>
-            <w:pict>
-              <v:shape w14:anchorId="251F9A15" id="Text Box 2" o:spid="_x0000_s1028" type="#_x0000_t202" alt="Applicant Name" style="position:absolute;margin-left:18.55pt;margin-top:696pt;width:1in;height:25.5pt;z-index:-251628544;visibility:visible;mso-wrap-style:none;mso-wrap-distance-left:9pt;mso-wrap-distance-top:0;mso-wrap-distance-right:9pt;mso-wrap-distance-bottom:0;mso-position-horizontal:absolute;mso-position-horizontal-relative:page;mso-position-vertical:absolute;mso-position-vertical-relative:text;v-text-anchor:top" o:gfxdata="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" fillcolor="white [3201]" stroked="f" strokeweight=".5pt">
-                <v:textbox>
-                  <w:txbxContent>
-                    <w:p>
-                      <w:r>
-                        <w:t>APPLICANT NAME PLACEHOLDER</w:t>
                       </w:r>
                     </w:p>
                   </w:txbxContent>
@@ -2162,11 +2845,11 @@
           </mc:Choice>
           <mc:Fallback>
             <w:pict>
-              <v:group w14:anchorId="29179C45" id="Group 61" o:spid="_x0000_s1029" alt="{seal}" style="position:absolute;margin-left:421.8pt;margin-top:690.6pt;width:83.3pt;height:83.4pt;z-index:251685888" coordsize="10584,10591" o:gfxdata="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">
+              <v:group w14:anchorId="29179C45" id="Group 61" o:spid="_x0000_s1030" alt="{seal}" style="position:absolute;margin-left:421.8pt;margin-top:690.6pt;width:83.3pt;height:83.4pt;z-index:251685888" coordsize="10584,10591" o:gfxdata="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">
                 <v:shapetype id="_x0000_t120" coordsize="21600,21600" o:spt="120" path="m10800,qx,10800,10800,21600,21600,10800,10800,xe">
                   <v:path gradientshapeok="t" o:connecttype="custom" o:connectlocs="10800,0;3163,3163;0,10800;3163,18437;10800,21600;18437,18437;21600,10800;18437,3163" textboxrect="3163,3163,18437,18437"/>
                 </v:shapetype>
-                <v:shape id="Flowchart: Connector 8" o:spid="_x0000_s1030" type="#_x0000_t120" style="position:absolute;width:10584;height:10591;visibility:visible;mso-wrap-style:square;v-text-anchor:middle" o:gfxdata="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" fillcolor="white [3201]" strokecolor="#7f7f7f [1612]" strokeweight=".25pt">
+                <v:shape id="Flowchart: Connector 8" o:spid="_x0000_s1031" type="#_x0000_t120" style="position:absolute;width:10584;height:10591;visibility:visible;mso-wrap-style:square;v-text-anchor:middle" o:gfxdata="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" fillcolor="white [3201]" strokecolor="#7f7f7f [1612]" strokeweight=".25pt">
                   <v:stroke joinstyle="miter"/>
                   <v:textbox>
                     <w:txbxContent>
@@ -2178,7 +2861,7 @@
                     </w:txbxContent>
                   </v:textbox>
                 </v:shape>
-                <v:shape id="_x0000_s1031" type="#_x0000_t202" style="position:absolute;left:1308;top:3768;width:8088;height:3689;visibility:visible;mso-wrap-style:square;v-text-anchor:top" o:gfxdata="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" stroked="f">
+                <v:shape id="_x0000_s1032" type="#_x0000_t202" style="position:absolute;left:1308;top:3768;width:8088;height:3689;visibility:visible;mso-wrap-style:square;v-text-anchor:top" o:gfxdata="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" stroked="f">
                   <v:textbox style="mso-fit-shape-to-text:t">
                     <w:txbxContent>
                       <w:p>
@@ -2228,7 +2911,7 @@
           <w:noProof/>
         </w:rPr>
         <w:drawing>
-          <wp:anchor distT="0" distB="0" distL="114300" distR="114300" simplePos="0" relativeHeight="251678720" behindDoc="1" locked="0" layoutInCell="1" allowOverlap="1" wp14:anchorId="74D6D023" wp14:editId="4258986E">
+          <wp:anchor distT="0" distB="0" distL="114300" distR="114300" simplePos="0" relativeHeight="251678720" behindDoc="1" locked="0" layoutInCell="1" allowOverlap="1" wp14:anchorId="74D6D023" wp14:editId="59758647">
             <wp:simplePos x="0" y="0"/>
             <wp:positionH relativeFrom="margin">
               <wp:posOffset>4245610</wp:posOffset>
@@ -2285,997 +2968,6 @@
       </w:r>
       <w:r>
         <w:rPr>
-          <w:noProof/>
-        </w:rPr>
-        <mc:AlternateContent>
-          <mc:Choice Requires="wps">
-            <w:drawing>
-              <wp:anchor distT="0" distB="0" distL="114300" distR="114300" simplePos="0" relativeHeight="251676672" behindDoc="0" locked="0" layoutInCell="1" allowOverlap="1" wp14:anchorId="5A0BFA9D" wp14:editId="2F69A958">
-                <wp:simplePos x="0" y="0"/>
-                <wp:positionH relativeFrom="column">
-                  <wp:posOffset>-576262</wp:posOffset>
-                </wp:positionH>
-                <wp:positionV relativeFrom="paragraph">
-                  <wp:posOffset>9086533</wp:posOffset>
-                </wp:positionV>
-                <wp:extent cx="2000250" cy="0"/>
-                <wp:effectExtent l="0" t="0" r="0" b="0"/>
-                <wp:wrapNone/>
-                <wp:docPr id="578890046" name="Straight Connector 31"/>
-                <wp:cNvGraphicFramePr/>
-                <a:graphic xmlns:a="http://schemas.openxmlformats.org/drawingml/2006/main">
-                  <a:graphicData uri="http://schemas.microsoft.com/office/word/2010/wordprocessingShape">
-                    <wps:wsp>
-                      <wps:cNvCnPr/>
-                      <wps:spPr>
-                        <a:xfrm flipV="1">
-                          <a:off x="0" y="0"/>
-                          <a:ext cx="2000250" cy="0"/>
-                        </a:xfrm>
-                        <a:prstGeom prst="line">
-                          <a:avLst/>
-                        </a:prstGeom>
-                        <a:ln w="12700">
-                          <a:solidFill>
-                            <a:schemeClr val="tx1"/>
-                          </a:solidFill>
-                        </a:ln>
-                      </wps:spPr>
-                      <wps:style>
-                        <a:lnRef idx="1">
-                          <a:schemeClr val="accent1"/>
-                        </a:lnRef>
-                        <a:fillRef idx="0">
-                          <a:schemeClr val="accent1"/>
-                        </a:fillRef>
-                        <a:effectRef idx="0">
-                          <a:schemeClr val="accent1"/>
-                        </a:effectRef>
-                        <a:fontRef idx="minor">
-                          <a:schemeClr val="tx1"/>
-                        </a:fontRef>
-                      </wps:style>
-                      <wps:bodyPr/>
-                    </wps:wsp>
-                  </a:graphicData>
-                </a:graphic>
-                <wp14:sizeRelH relativeFrom="margin">
-                  <wp14:pctWidth>0</wp14:pctWidth>
-                </wp14:sizeRelH>
-                <wp14:sizeRelV relativeFrom="margin">
-                  <wp14:pctHeight>0</wp14:pctHeight>
-                </wp14:sizeRelV>
-              </wp:anchor>
-            </w:drawing>
-          </mc:Choice>
-          <mc:Fallback>
-            <w:pict>
-              <v:line w14:anchorId="69AED595" id="Straight Connector 31" o:spid="_x0000_s1026" style="position:absolute;flip:y;z-index:251676672;visibility:visible;mso-wrap-style:square;mso-width-percent:0;mso-height-percent:0;mso-wrap-distance-left:9pt;mso-wrap-distance-top:0;mso-wrap-distance-right:9pt;mso-wrap-distance-bottom:0;mso-position-horizontal:absolute;mso-position-horizontal-relative:text;mso-position-vertical:absolute;mso-position-vertical-relative:text;mso-width-percent:0;mso-height-percent:0;mso-width-relative:margin;mso-height-relative:margin" from="-45.35pt,715.5pt" to="112.15pt,715.5pt" o:gfxdata="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" strokecolor="black [3213]" strokeweight="1pt">
-                <v:stroke joinstyle="miter"/>
-              </v:line>
-            </w:pict>
-          </mc:Fallback>
-        </mc:AlternateContent>
-      </w:r>
-      <w:r>
-        <w:rPr>
-          <w:noProof/>
-        </w:rPr>
-        <mc:AlternateContent>
-          <mc:Choice Requires="wps">
-            <w:drawing>
-              <wp:anchor distT="0" distB="0" distL="114300" distR="114300" simplePos="0" relativeHeight="251674624" behindDoc="0" locked="0" layoutInCell="1" allowOverlap="1" wp14:anchorId="6AB430F5" wp14:editId="2B1E14D5">
-                <wp:simplePos x="0" y="0"/>
-                <wp:positionH relativeFrom="column">
-                  <wp:posOffset>-766762</wp:posOffset>
-                </wp:positionH>
-                <wp:positionV relativeFrom="paragraph">
-                  <wp:posOffset>9048432</wp:posOffset>
-                </wp:positionV>
-                <wp:extent cx="2477822" cy="213456"/>
-                <wp:effectExtent l="0" t="0" r="0" b="0"/>
-                <wp:wrapNone/>
-                <wp:docPr id="1858936305" name="Text Box 34"/>
-                <wp:cNvGraphicFramePr/>
-                <a:graphic xmlns:a="http://schemas.openxmlformats.org/drawingml/2006/main">
-                  <a:graphicData uri="http://schemas.microsoft.com/office/word/2010/wordprocessingShape">
-                    <wps:wsp>
-                      <wps:cNvSpPr txBox="1"/>
-                      <wps:spPr>
-                        <a:xfrm>
-                          <a:off x="0" y="0"/>
-                          <a:ext cx="2477822" cy="213456"/>
-                        </a:xfrm>
-                        <a:prstGeom prst="rect">
-                          <a:avLst/>
-                        </a:prstGeom>
-                        <a:solidFill>
-                          <a:schemeClr val="lt1"/>
-                        </a:solidFill>
-                        <a:ln w="6350">
-                          <a:noFill/>
-                        </a:ln>
-                      </wps:spPr>
-                      <wps:txbx>
-                        <w:txbxContent>
-                          <w:p>
-                            <w:pPr>
-                              <w:widowControl w:val="0"/>
-                              <w:autoSpaceDE w:val="0"/>
-                              <w:spacing w:after="0" w:line="240" w:lineRule="auto"/>
-                              <w:ind w:left="118"/>
-                              <w:rPr>
-                                <w:noProof/>
-                              </w:rPr>
-                            </w:pPr>
-                            <w:r>
-                              <w:rPr>
-                                <w:rFonts w:ascii="Times New Roman" w:hAnsi="Times New Roman"/>
-                                <w:w w:val="111"/>
-                                <w:kern w:val="0"/>
-                                <w:sz w:val="18"/>
-                                <w:szCs w:val="18"/>
-                              </w:rPr>
-                              <w:t>A</w:t>
-                            </w:r>
-                            <w:r>
-                              <w:rPr>
-                                <w:rFonts w:ascii="Times New Roman" w:hAnsi="Times New Roman"/>
-                                <w:spacing w:val="1"/>
-                                <w:w w:val="111"/>
-                                <w:kern w:val="0"/>
-                                <w:sz w:val="18"/>
-                                <w:szCs w:val="18"/>
-                              </w:rPr>
-                              <w:t>pp</w:t>
-                            </w:r>
-                            <w:r>
-                              <w:rPr>
-                                <w:rFonts w:ascii="Times New Roman" w:hAnsi="Times New Roman"/>
-                                <w:spacing w:val="-1"/>
-                                <w:w w:val="111"/>
-                                <w:kern w:val="0"/>
-                                <w:sz w:val="18"/>
-                                <w:szCs w:val="18"/>
-                              </w:rPr>
-                              <w:t>l</w:t>
-                            </w:r>
-                            <w:r>
-                              <w:rPr>
-                                <w:rFonts w:ascii="Times New Roman" w:hAnsi="Times New Roman"/>
-                                <w:spacing w:val="1"/>
-                                <w:w w:val="111"/>
-                                <w:kern w:val="0"/>
-                                <w:sz w:val="18"/>
-                                <w:szCs w:val="18"/>
-                              </w:rPr>
-                              <w:t>ic</w:t>
-                            </w:r>
-                            <w:r>
-                              <w:rPr>
-                                <w:rFonts w:ascii="Times New Roman" w:hAnsi="Times New Roman"/>
-                                <w:w w:val="111"/>
-                                <w:kern w:val="0"/>
-                                <w:sz w:val="18"/>
-                                <w:szCs w:val="18"/>
-                              </w:rPr>
-                              <w:t>a</w:t>
-                            </w:r>
-                            <w:r>
-                              <w:rPr>
-                                <w:rFonts w:ascii="Times New Roman" w:hAnsi="Times New Roman"/>
-                                <w:spacing w:val="1"/>
-                                <w:w w:val="111"/>
-                                <w:kern w:val="0"/>
-                                <w:sz w:val="18"/>
-                                <w:szCs w:val="18"/>
-                              </w:rPr>
-                              <w:t>n</w:t>
-                            </w:r>
-                            <w:r>
-                              <w:rPr>
-                                <w:rFonts w:ascii="Times New Roman" w:hAnsi="Times New Roman"/>
-                                <w:w w:val="111"/>
-                                <w:kern w:val="0"/>
-                                <w:sz w:val="18"/>
-                                <w:szCs w:val="18"/>
-                              </w:rPr>
-                              <w:t>t</w:t>
-                            </w:r>
-                            <w:r>
-                              <w:rPr>
-                                <w:rFonts w:ascii="Times New Roman" w:hAnsi="Times New Roman"/>
-                                <w:spacing w:val="-5"/>
-                                <w:w w:val="111"/>
-                                <w:kern w:val="0"/>
-                                <w:sz w:val="18"/>
-                                <w:szCs w:val="18"/>
-                              </w:rPr>
-                              <w:t xml:space="preserve"> </w:t>
-                            </w:r>
-                            <w:r>
-                              <w:rPr>
-                                <w:rFonts w:ascii="Times New Roman" w:hAnsi="Times New Roman"/>
-                                <w:spacing w:val="1"/>
-                                <w:w w:val="111"/>
-                                <w:kern w:val="0"/>
-                                <w:sz w:val="18"/>
-                                <w:szCs w:val="18"/>
-                              </w:rPr>
-                              <w:t>S</w:t>
-                            </w:r>
-                            <w:r>
-                              <w:rPr>
-                                <w:rFonts w:ascii="Times New Roman" w:hAnsi="Times New Roman"/>
-                                <w:spacing w:val="-1"/>
-                                <w:w w:val="111"/>
-                                <w:kern w:val="0"/>
-                                <w:sz w:val="18"/>
-                                <w:szCs w:val="18"/>
-                              </w:rPr>
-                              <w:t>i</w:t>
-                            </w:r>
-                            <w:r>
-                              <w:rPr>
-                                <w:rFonts w:ascii="Times New Roman" w:hAnsi="Times New Roman"/>
-                                <w:spacing w:val="2"/>
-                                <w:w w:val="111"/>
-                                <w:kern w:val="0"/>
-                                <w:sz w:val="18"/>
-                                <w:szCs w:val="18"/>
-                              </w:rPr>
-                              <w:t>g</w:t>
-                            </w:r>
-                            <w:r>
-                              <w:rPr>
-                                <w:rFonts w:ascii="Times New Roman" w:hAnsi="Times New Roman"/>
-                                <w:spacing w:val="-1"/>
-                                <w:w w:val="111"/>
-                                <w:kern w:val="0"/>
-                                <w:sz w:val="18"/>
-                                <w:szCs w:val="18"/>
-                              </w:rPr>
-                              <w:t>n</w:t>
-                            </w:r>
-                            <w:r>
-                              <w:rPr>
-                                <w:rFonts w:ascii="Times New Roman" w:hAnsi="Times New Roman"/>
-                                <w:spacing w:val="4"/>
-                                <w:w w:val="111"/>
-                                <w:kern w:val="0"/>
-                                <w:sz w:val="18"/>
-                                <w:szCs w:val="18"/>
-                              </w:rPr>
-                              <w:t>a</w:t>
-                            </w:r>
-                            <w:r>
-                              <w:rPr>
-                                <w:rFonts w:ascii="Times New Roman" w:hAnsi="Times New Roman"/>
-                                <w:spacing w:val="-1"/>
-                                <w:w w:val="111"/>
-                                <w:kern w:val="0"/>
-                                <w:sz w:val="18"/>
-                                <w:szCs w:val="18"/>
-                              </w:rPr>
-                              <w:t>tu</w:t>
-                            </w:r>
-                            <w:r>
-                              <w:rPr>
-                                <w:rFonts w:ascii="Times New Roman" w:hAnsi="Times New Roman"/>
-                                <w:spacing w:val="1"/>
-                                <w:w w:val="111"/>
-                                <w:kern w:val="0"/>
-                                <w:sz w:val="18"/>
-                                <w:szCs w:val="18"/>
-                              </w:rPr>
-                              <w:t>r</w:t>
-                            </w:r>
-                            <w:r>
-                              <w:rPr>
-                                <w:rFonts w:ascii="Times New Roman" w:hAnsi="Times New Roman"/>
-                                <w:w w:val="111"/>
-                                <w:kern w:val="0"/>
-                                <w:sz w:val="18"/>
-                                <w:szCs w:val="18"/>
-                              </w:rPr>
-                              <w:t>e</w:t>
-                            </w:r>
-                            <w:r>
-                              <w:rPr>
-                                <w:rFonts w:ascii="Times New Roman" w:hAnsi="Times New Roman"/>
-                                <w:spacing w:val="9"/>
-                                <w:w w:val="111"/>
-                                <w:kern w:val="0"/>
-                                <w:sz w:val="18"/>
-                                <w:szCs w:val="18"/>
-                              </w:rPr>
-                              <w:t xml:space="preserve"> </w:t>
-                            </w:r>
-                            <w:r>
-                              <w:rPr>
-                                <w:rFonts w:ascii="Times New Roman" w:hAnsi="Times New Roman"/>
-                                <w:w w:val="103"/>
-                                <w:kern w:val="0"/>
-                                <w:sz w:val="18"/>
-                                <w:szCs w:val="18"/>
-                              </w:rPr>
-                              <w:t>o</w:t>
-                            </w:r>
-                            <w:r>
-                              <w:rPr>
-                                <w:rFonts w:ascii="Times New Roman" w:hAnsi="Times New Roman"/>
-                                <w:spacing w:val="2"/>
-                                <w:w w:val="103"/>
-                                <w:kern w:val="0"/>
-                                <w:sz w:val="18"/>
-                                <w:szCs w:val="18"/>
-                              </w:rPr>
-                              <w:t>v</w:t>
-                            </w:r>
-                            <w:r>
-                              <w:rPr>
-                                <w:rFonts w:ascii="Times New Roman" w:hAnsi="Times New Roman"/>
-                                <w:spacing w:val="-1"/>
-                                <w:w w:val="103"/>
-                                <w:kern w:val="0"/>
-                                <w:sz w:val="18"/>
-                                <w:szCs w:val="18"/>
-                              </w:rPr>
-                              <w:t>e</w:t>
-                            </w:r>
-                            <w:r>
-                              <w:rPr>
-                                <w:rFonts w:ascii="Times New Roman" w:hAnsi="Times New Roman"/>
-                                <w:w w:val="138"/>
-                                <w:kern w:val="0"/>
-                                <w:sz w:val="18"/>
-                                <w:szCs w:val="18"/>
-                              </w:rPr>
-                              <w:t>r</w:t>
-                            </w:r>
-                            <w:r>
-                              <w:rPr>
-                                <w:rFonts w:ascii="Times New Roman" w:hAnsi="Times New Roman"/>
-                                <w:spacing w:val="3"/>
-                                <w:kern w:val="0"/>
-                                <w:sz w:val="18"/>
-                                <w:szCs w:val="18"/>
-                              </w:rPr>
-                              <w:t xml:space="preserve"> </w:t>
-                            </w:r>
-                            <w:r>
-                              <w:rPr>
-                                <w:rFonts w:ascii="Times New Roman" w:hAnsi="Times New Roman"/>
-                                <w:spacing w:val="2"/>
-                                <w:w w:val="115"/>
-                                <w:kern w:val="0"/>
-                                <w:sz w:val="18"/>
-                                <w:szCs w:val="18"/>
-                              </w:rPr>
-                              <w:t>P</w:t>
-                            </w:r>
-                            <w:r>
-                              <w:rPr>
-                                <w:rFonts w:ascii="Times New Roman" w:hAnsi="Times New Roman"/>
-                                <w:spacing w:val="1"/>
-                                <w:w w:val="115"/>
-                                <w:kern w:val="0"/>
-                                <w:sz w:val="18"/>
-                                <w:szCs w:val="18"/>
-                              </w:rPr>
-                              <w:t>r</w:t>
-                            </w:r>
-                            <w:r>
-                              <w:rPr>
-                                <w:rFonts w:ascii="Times New Roman" w:hAnsi="Times New Roman"/>
-                                <w:spacing w:val="-1"/>
-                                <w:w w:val="115"/>
-                                <w:kern w:val="0"/>
-                                <w:sz w:val="18"/>
-                                <w:szCs w:val="18"/>
-                              </w:rPr>
-                              <w:t>in</w:t>
-                            </w:r>
-                            <w:r>
-                              <w:rPr>
-                                <w:rFonts w:ascii="Times New Roman" w:hAnsi="Times New Roman"/>
-                                <w:spacing w:val="3"/>
-                                <w:w w:val="115"/>
-                                <w:kern w:val="0"/>
-                                <w:sz w:val="18"/>
-                                <w:szCs w:val="18"/>
-                              </w:rPr>
-                              <w:t>t</w:t>
-                            </w:r>
-                            <w:r>
-                              <w:rPr>
-                                <w:rFonts w:ascii="Times New Roman" w:hAnsi="Times New Roman"/>
-                                <w:spacing w:val="1"/>
-                                <w:w w:val="115"/>
-                                <w:kern w:val="0"/>
-                                <w:sz w:val="18"/>
-                                <w:szCs w:val="18"/>
-                              </w:rPr>
-                              <w:t>e</w:t>
-                            </w:r>
-                            <w:r>
-                              <w:rPr>
-                                <w:rFonts w:ascii="Times New Roman" w:hAnsi="Times New Roman"/>
-                                <w:w w:val="115"/>
-                                <w:kern w:val="0"/>
-                                <w:sz w:val="18"/>
-                                <w:szCs w:val="18"/>
-                              </w:rPr>
-                              <w:t>d</w:t>
-                            </w:r>
-                            <w:r>
-                              <w:rPr>
-                                <w:rFonts w:ascii="Times New Roman" w:hAnsi="Times New Roman"/>
-                                <w:spacing w:val="-8"/>
-                                <w:w w:val="115"/>
-                                <w:kern w:val="0"/>
-                                <w:sz w:val="18"/>
-                                <w:szCs w:val="18"/>
-                              </w:rPr>
-                              <w:t xml:space="preserve"> </w:t>
-                            </w:r>
-                            <w:r>
-                              <w:rPr>
-                                <w:rFonts w:ascii="Times New Roman" w:hAnsi="Times New Roman"/>
-                                <w:spacing w:val="3"/>
-                                <w:w w:val="103"/>
-                                <w:kern w:val="0"/>
-                                <w:sz w:val="18"/>
-                                <w:szCs w:val="18"/>
-                              </w:rPr>
-                              <w:t>N</w:t>
-                            </w:r>
-                            <w:r>
-                              <w:rPr>
-                                <w:rFonts w:ascii="Times New Roman" w:hAnsi="Times New Roman"/>
-                                <w:w w:val="117"/>
-                                <w:kern w:val="0"/>
-                                <w:sz w:val="18"/>
-                                <w:szCs w:val="18"/>
-                              </w:rPr>
-                              <w:t>a</w:t>
-                            </w:r>
-                            <w:r>
-                              <w:rPr>
-                                <w:rFonts w:ascii="Times New Roman" w:hAnsi="Times New Roman"/>
-                                <w:spacing w:val="1"/>
-                                <w:w w:val="111"/>
-                                <w:kern w:val="0"/>
-                                <w:sz w:val="18"/>
-                                <w:szCs w:val="18"/>
-                              </w:rPr>
-                              <w:t>m</w:t>
-                            </w:r>
-                            <w:r>
-                              <w:rPr>
-                                <w:rFonts w:ascii="Times New Roman" w:hAnsi="Times New Roman"/>
-                                <w:w w:val="103"/>
-                                <w:kern w:val="0"/>
-                                <w:sz w:val="18"/>
-                                <w:szCs w:val="18"/>
-                              </w:rPr>
-                              <w:t>e</w:t>
-                            </w:r>
-                          </w:p>
-                          <w:p/>
-                        </w:txbxContent>
-                      </wps:txbx>
-                      <wps:bodyPr rot="0" spcFirstLastPara="0" vertOverflow="overflow" horzOverflow="overflow" vert="horz" wrap="square" lIns="91440" tIns="45720" rIns="91440" bIns="45720" numCol="1" spcCol="0" rtlCol="0" fromWordArt="0" anchor="t" anchorCtr="0" forceAA="0" compatLnSpc="1">
-                        <a:prstTxWarp prst="textNoShape">
-                          <a:avLst/>
-                        </a:prstTxWarp>
-                        <a:noAutofit/>
-                      </wps:bodyPr>
-                    </wps:wsp>
-                  </a:graphicData>
-                </a:graphic>
-                <wp14:sizeRelH relativeFrom="margin">
-                  <wp14:pctWidth>0</wp14:pctWidth>
-                </wp14:sizeRelH>
-              </wp:anchor>
-            </w:drawing>
-          </mc:Choice>
-          <mc:Fallback>
-            <w:pict>
-              <v:shape w14:anchorId="6AB430F5" id="Text Box 34" o:spid="_x0000_s1032" type="#_x0000_t202" style="position:absolute;margin-left:-60.35pt;margin-top:712.45pt;width:195.1pt;height:16.8pt;z-index:251674624;visibility:visible;mso-wrap-style:square;mso-width-percent:0;mso-wrap-distance-left:9pt;mso-wrap-distance-top:0;mso-wrap-distance-right:9pt;mso-wrap-distance-bottom:0;mso-position-horizontal:absolute;mso-position-horizontal-relative:text;mso-position-vertical:absolute;mso-position-vertical-relative:text;mso-width-percent:0;mso-width-relative:margin;v-text-anchor:top" o:gfxdata="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" fillcolor="white [3201]" stroked="f" strokeweight=".5pt">
-                <v:textbox>
-                  <w:txbxContent>
-                    <w:p>
-                      <w:pPr>
-                        <w:widowControl w:val="0"/>
-                        <w:autoSpaceDE w:val="0"/>
-                        <w:spacing w:after="0" w:line="240" w:lineRule="auto"/>
-                        <w:ind w:left="118"/>
-                        <w:rPr>
-                          <w:noProof/>
-                        </w:rPr>
-                      </w:pPr>
-                      <w:r>
-                        <w:rPr>
-                          <w:rFonts w:ascii="Times New Roman" w:hAnsi="Times New Roman"/>
-                          <w:w w:val="111"/>
-                          <w:kern w:val="0"/>
-                          <w:sz w:val="18"/>
-                          <w:szCs w:val="18"/>
-                        </w:rPr>
-                        <w:t>A</w:t>
-                      </w:r>
-                      <w:r>
-                        <w:rPr>
-                          <w:rFonts w:ascii="Times New Roman" w:hAnsi="Times New Roman"/>
-                          <w:spacing w:val="1"/>
-                          <w:w w:val="111"/>
-                          <w:kern w:val="0"/>
-                          <w:sz w:val="18"/>
-                          <w:szCs w:val="18"/>
-                        </w:rPr>
-                        <w:t>pp</w:t>
-                      </w:r>
-                      <w:r>
-                        <w:rPr>
-                          <w:rFonts w:ascii="Times New Roman" w:hAnsi="Times New Roman"/>
-                          <w:spacing w:val="-1"/>
-                          <w:w w:val="111"/>
-                          <w:kern w:val="0"/>
-                          <w:sz w:val="18"/>
-                          <w:szCs w:val="18"/>
-                        </w:rPr>
-                        <w:t>l</w:t>
-                      </w:r>
-                      <w:r>
-                        <w:rPr>
-                          <w:rFonts w:ascii="Times New Roman" w:hAnsi="Times New Roman"/>
-                          <w:spacing w:val="1"/>
-                          <w:w w:val="111"/>
-                          <w:kern w:val="0"/>
-                          <w:sz w:val="18"/>
-                          <w:szCs w:val="18"/>
-                        </w:rPr>
-                        <w:t>ic</w:t>
-                      </w:r>
-                      <w:r>
-                        <w:rPr>
-                          <w:rFonts w:ascii="Times New Roman" w:hAnsi="Times New Roman"/>
-                          <w:w w:val="111"/>
-                          <w:kern w:val="0"/>
-                          <w:sz w:val="18"/>
-                          <w:szCs w:val="18"/>
-                        </w:rPr>
-                        <w:t>a</w:t>
-                      </w:r>
-                      <w:r>
-                        <w:rPr>
-                          <w:rFonts w:ascii="Times New Roman" w:hAnsi="Times New Roman"/>
-                          <w:spacing w:val="1"/>
-                          <w:w w:val="111"/>
-                          <w:kern w:val="0"/>
-                          <w:sz w:val="18"/>
-                          <w:szCs w:val="18"/>
-                        </w:rPr>
-                        <w:t>n</w:t>
-                      </w:r>
-                      <w:r>
-                        <w:rPr>
-                          <w:rFonts w:ascii="Times New Roman" w:hAnsi="Times New Roman"/>
-                          <w:w w:val="111"/>
-                          <w:kern w:val="0"/>
-                          <w:sz w:val="18"/>
-                          <w:szCs w:val="18"/>
-                        </w:rPr>
-                        <w:t>t</w:t>
-                      </w:r>
-                      <w:r>
-                        <w:rPr>
-                          <w:rFonts w:ascii="Times New Roman" w:hAnsi="Times New Roman"/>
-                          <w:spacing w:val="-5"/>
-                          <w:w w:val="111"/>
-                          <w:kern w:val="0"/>
-                          <w:sz w:val="18"/>
-                          <w:szCs w:val="18"/>
-                        </w:rPr>
-                        <w:t xml:space="preserve"> </w:t>
-                      </w:r>
-                      <w:r>
-                        <w:rPr>
-                          <w:rFonts w:ascii="Times New Roman" w:hAnsi="Times New Roman"/>
-                          <w:spacing w:val="1"/>
-                          <w:w w:val="111"/>
-                          <w:kern w:val="0"/>
-                          <w:sz w:val="18"/>
-                          <w:szCs w:val="18"/>
-                        </w:rPr>
-                        <w:t>S</w:t>
-                      </w:r>
-                      <w:r>
-                        <w:rPr>
-                          <w:rFonts w:ascii="Times New Roman" w:hAnsi="Times New Roman"/>
-                          <w:spacing w:val="-1"/>
-                          <w:w w:val="111"/>
-                          <w:kern w:val="0"/>
-                          <w:sz w:val="18"/>
-                          <w:szCs w:val="18"/>
-                        </w:rPr>
-                        <w:t>i</w:t>
-                      </w:r>
-                      <w:r>
-                        <w:rPr>
-                          <w:rFonts w:ascii="Times New Roman" w:hAnsi="Times New Roman"/>
-                          <w:spacing w:val="2"/>
-                          <w:w w:val="111"/>
-                          <w:kern w:val="0"/>
-                          <w:sz w:val="18"/>
-                          <w:szCs w:val="18"/>
-                        </w:rPr>
-                        <w:t>g</w:t>
-                      </w:r>
-                      <w:r>
-                        <w:rPr>
-                          <w:rFonts w:ascii="Times New Roman" w:hAnsi="Times New Roman"/>
-                          <w:spacing w:val="-1"/>
-                          <w:w w:val="111"/>
-                          <w:kern w:val="0"/>
-                          <w:sz w:val="18"/>
-                          <w:szCs w:val="18"/>
-                        </w:rPr>
-                        <w:t>n</w:t>
-                      </w:r>
-                      <w:r>
-                        <w:rPr>
-                          <w:rFonts w:ascii="Times New Roman" w:hAnsi="Times New Roman"/>
-                          <w:spacing w:val="4"/>
-                          <w:w w:val="111"/>
-                          <w:kern w:val="0"/>
-                          <w:sz w:val="18"/>
-                          <w:szCs w:val="18"/>
-                        </w:rPr>
-                        <w:t>a</w:t>
-                      </w:r>
-                      <w:r>
-                        <w:rPr>
-                          <w:rFonts w:ascii="Times New Roman" w:hAnsi="Times New Roman"/>
-                          <w:spacing w:val="-1"/>
-                          <w:w w:val="111"/>
-                          <w:kern w:val="0"/>
-                          <w:sz w:val="18"/>
-                          <w:szCs w:val="18"/>
-                        </w:rPr>
-                        <w:t>tu</w:t>
-                      </w:r>
-                      <w:r>
-                        <w:rPr>
-                          <w:rFonts w:ascii="Times New Roman" w:hAnsi="Times New Roman"/>
-                          <w:spacing w:val="1"/>
-                          <w:w w:val="111"/>
-                          <w:kern w:val="0"/>
-                          <w:sz w:val="18"/>
-                          <w:szCs w:val="18"/>
-                        </w:rPr>
-                        <w:t>r</w:t>
-                      </w:r>
-                      <w:r>
-                        <w:rPr>
-                          <w:rFonts w:ascii="Times New Roman" w:hAnsi="Times New Roman"/>
-                          <w:w w:val="111"/>
-                          <w:kern w:val="0"/>
-                          <w:sz w:val="18"/>
-                          <w:szCs w:val="18"/>
-                        </w:rPr>
-                        <w:t>e</w:t>
-                      </w:r>
-                      <w:r>
-                        <w:rPr>
-                          <w:rFonts w:ascii="Times New Roman" w:hAnsi="Times New Roman"/>
-                          <w:spacing w:val="9"/>
-                          <w:w w:val="111"/>
-                          <w:kern w:val="0"/>
-                          <w:sz w:val="18"/>
-                          <w:szCs w:val="18"/>
-                        </w:rPr>
-                        <w:t xml:space="preserve"> </w:t>
-                      </w:r>
-                      <w:r>
-                        <w:rPr>
-                          <w:rFonts w:ascii="Times New Roman" w:hAnsi="Times New Roman"/>
-                          <w:w w:val="103"/>
-                          <w:kern w:val="0"/>
-                          <w:sz w:val="18"/>
-                          <w:szCs w:val="18"/>
-                        </w:rPr>
-                        <w:t>o</w:t>
-                      </w:r>
-                      <w:r>
-                        <w:rPr>
-                          <w:rFonts w:ascii="Times New Roman" w:hAnsi="Times New Roman"/>
-                          <w:spacing w:val="2"/>
-                          <w:w w:val="103"/>
-                          <w:kern w:val="0"/>
-                          <w:sz w:val="18"/>
-                          <w:szCs w:val="18"/>
-                        </w:rPr>
-                        <w:t>v</w:t>
-                      </w:r>
-                      <w:r>
-                        <w:rPr>
-                          <w:rFonts w:ascii="Times New Roman" w:hAnsi="Times New Roman"/>
-                          <w:spacing w:val="-1"/>
-                          <w:w w:val="103"/>
-                          <w:kern w:val="0"/>
-                          <w:sz w:val="18"/>
-                          <w:szCs w:val="18"/>
-                        </w:rPr>
-                        <w:t>e</w:t>
-                      </w:r>
-                      <w:r>
-                        <w:rPr>
-                          <w:rFonts w:ascii="Times New Roman" w:hAnsi="Times New Roman"/>
-                          <w:w w:val="138"/>
-                          <w:kern w:val="0"/>
-                          <w:sz w:val="18"/>
-                          <w:szCs w:val="18"/>
-                        </w:rPr>
-                        <w:t>r</w:t>
-                      </w:r>
-                      <w:r>
-                        <w:rPr>
-                          <w:rFonts w:ascii="Times New Roman" w:hAnsi="Times New Roman"/>
-                          <w:spacing w:val="3"/>
-                          <w:kern w:val="0"/>
-                          <w:sz w:val="18"/>
-                          <w:szCs w:val="18"/>
-                        </w:rPr>
-                        <w:t xml:space="preserve"> </w:t>
-                      </w:r>
-                      <w:r>
-                        <w:rPr>
-                          <w:rFonts w:ascii="Times New Roman" w:hAnsi="Times New Roman"/>
-                          <w:spacing w:val="2"/>
-                          <w:w w:val="115"/>
-                          <w:kern w:val="0"/>
-                          <w:sz w:val="18"/>
-                          <w:szCs w:val="18"/>
-                        </w:rPr>
-                        <w:t>P</w:t>
-                      </w:r>
-                      <w:r>
-                        <w:rPr>
-                          <w:rFonts w:ascii="Times New Roman" w:hAnsi="Times New Roman"/>
-                          <w:spacing w:val="1"/>
-                          <w:w w:val="115"/>
-                          <w:kern w:val="0"/>
-                          <w:sz w:val="18"/>
-                          <w:szCs w:val="18"/>
-                        </w:rPr>
-                        <w:t>r</w:t>
-                      </w:r>
-                      <w:r>
-                        <w:rPr>
-                          <w:rFonts w:ascii="Times New Roman" w:hAnsi="Times New Roman"/>
-                          <w:spacing w:val="-1"/>
-                          <w:w w:val="115"/>
-                          <w:kern w:val="0"/>
-                          <w:sz w:val="18"/>
-                          <w:szCs w:val="18"/>
-                        </w:rPr>
-                        <w:t>in</w:t>
-                      </w:r>
-                      <w:r>
-                        <w:rPr>
-                          <w:rFonts w:ascii="Times New Roman" w:hAnsi="Times New Roman"/>
-                          <w:spacing w:val="3"/>
-                          <w:w w:val="115"/>
-                          <w:kern w:val="0"/>
-                          <w:sz w:val="18"/>
-                          <w:szCs w:val="18"/>
-                        </w:rPr>
-                        <w:t>t</w:t>
-                      </w:r>
-                      <w:r>
-                        <w:rPr>
-                          <w:rFonts w:ascii="Times New Roman" w:hAnsi="Times New Roman"/>
-                          <w:spacing w:val="1"/>
-                          <w:w w:val="115"/>
-                          <w:kern w:val="0"/>
-                          <w:sz w:val="18"/>
-                          <w:szCs w:val="18"/>
-                        </w:rPr>
-                        <w:t>e</w:t>
-                      </w:r>
-                      <w:r>
-                        <w:rPr>
-                          <w:rFonts w:ascii="Times New Roman" w:hAnsi="Times New Roman"/>
-                          <w:w w:val="115"/>
-                          <w:kern w:val="0"/>
-                          <w:sz w:val="18"/>
-                          <w:szCs w:val="18"/>
-                        </w:rPr>
-                        <w:t>d</w:t>
-                      </w:r>
-                      <w:r>
-                        <w:rPr>
-                          <w:rFonts w:ascii="Times New Roman" w:hAnsi="Times New Roman"/>
-                          <w:spacing w:val="-8"/>
-                          <w:w w:val="115"/>
-                          <w:kern w:val="0"/>
-                          <w:sz w:val="18"/>
-                          <w:szCs w:val="18"/>
-                        </w:rPr>
-                        <w:t xml:space="preserve"> </w:t>
-                      </w:r>
-                      <w:r>
-                        <w:rPr>
-                          <w:rFonts w:ascii="Times New Roman" w:hAnsi="Times New Roman"/>
-                          <w:spacing w:val="3"/>
-                          <w:w w:val="103"/>
-                          <w:kern w:val="0"/>
-                          <w:sz w:val="18"/>
-                          <w:szCs w:val="18"/>
-                        </w:rPr>
-                        <w:t>N</w:t>
-                      </w:r>
-                      <w:r>
-                        <w:rPr>
-                          <w:rFonts w:ascii="Times New Roman" w:hAnsi="Times New Roman"/>
-                          <w:w w:val="117"/>
-                          <w:kern w:val="0"/>
-                          <w:sz w:val="18"/>
-                          <w:szCs w:val="18"/>
-                        </w:rPr>
-                        <w:t>a</w:t>
-                      </w:r>
-                      <w:r>
-                        <w:rPr>
-                          <w:rFonts w:ascii="Times New Roman" w:hAnsi="Times New Roman"/>
-                          <w:spacing w:val="1"/>
-                          <w:w w:val="111"/>
-                          <w:kern w:val="0"/>
-                          <w:sz w:val="18"/>
-                          <w:szCs w:val="18"/>
-                        </w:rPr>
-                        <w:t>m</w:t>
-                      </w:r>
-                      <w:r>
-                        <w:rPr>
-                          <w:rFonts w:ascii="Times New Roman" w:hAnsi="Times New Roman"/>
-                          <w:w w:val="103"/>
-                          <w:kern w:val="0"/>
-                          <w:sz w:val="18"/>
-                          <w:szCs w:val="18"/>
-                        </w:rPr>
-                        <w:t>e</w:t>
-                      </w:r>
-                    </w:p>
-                    <w:p/>
-                  </w:txbxContent>
-                </v:textbox>
-              </v:shape>
-            </w:pict>
-          </mc:Fallback>
-        </mc:AlternateContent>
-      </w:r>
-      <w:r>
-        <w:rPr>
-          <w:rFonts w:ascii="Times New Roman" w:hAnsi="Times New Roman"/>
-          <w:noProof/>
-          <w:kern w:val="0"/>
-          <w:sz w:val="20"/>
-          <w:szCs w:val="20"/>
-        </w:rPr>
-        <mc:AlternateContent>
-          <mc:Choice Requires="wps">
-            <w:drawing>
-              <wp:anchor distT="0" distB="0" distL="114300" distR="114300" simplePos="0" relativeHeight="251668480" behindDoc="0" locked="0" layoutInCell="1" allowOverlap="1" wp14:anchorId="30FE07A7" wp14:editId="54A790A5">
-                <wp:simplePos x="0" y="0"/>
-                <wp:positionH relativeFrom="column">
-                  <wp:posOffset>-584835</wp:posOffset>
-                </wp:positionH>
-                <wp:positionV relativeFrom="paragraph">
-                  <wp:posOffset>8854440</wp:posOffset>
-                </wp:positionV>
-                <wp:extent cx="2353786" cy="274031"/>
-                <wp:effectExtent l="0" t="0" r="0" b="0"/>
-                <wp:wrapNone/>
-                <wp:docPr id="81520890" name="Text Box 37" descr="Applicant Name"/>
-                <wp:cNvGraphicFramePr/>
-                <a:graphic xmlns:a="http://schemas.openxmlformats.org/drawingml/2006/main">
-                  <a:graphicData uri="http://schemas.microsoft.com/office/word/2010/wordprocessingShape">
-                    <wps:wsp>
-                      <wps:cNvSpPr txBox="1"/>
-                      <wps:spPr>
-                        <a:xfrm>
-                          <a:off x="0" y="0"/>
-                          <a:ext cx="2353786" cy="274031"/>
-                        </a:xfrm>
-                        <a:prstGeom prst="rect">
-                          <a:avLst/>
-                        </a:prstGeom>
-                        <a:noFill/>
-                        <a:ln w="6350">
-                          <a:noFill/>
-                        </a:ln>
-                      </wps:spPr>
-                      <wps:txbx>
-                        <w:txbxContent>
-                          <w:p>
-                            <w:pPr>
-                              <w:widowControl w:val="0"/>
-                              <w:autoSpaceDE w:val="0"/>
-                              <w:spacing w:after="0" w:line="240" w:lineRule="auto"/>
-                              <w:rPr>
-                                <w:rFonts w:ascii="Times New Roman" w:hAnsi="Times New Roman"/>
-                                <w:kern w:val="0"/>
-                                <w:sz w:val="18"/>
-                                <w:szCs w:val="18"/>
-                              </w:rPr>
-                            </w:pPr>
-                          </w:p>
-                          <w:p>
-                            <w:pPr>
-                              <w:rPr>
-                                <w:b/>
-                                <w:bCs/>
-                              </w:rPr>
-                            </w:pPr>
-                          </w:p>
-                        </w:txbxContent>
-                      </wps:txbx>
-                      <wps:bodyPr rot="0" spcFirstLastPara="0" vertOverflow="overflow" horzOverflow="overflow" vert="horz" wrap="square" lIns="91440" tIns="45720" rIns="91440" bIns="45720" numCol="1" spcCol="0" rtlCol="0" fromWordArt="0" anchor="t" anchorCtr="0" forceAA="0" compatLnSpc="1">
-                        <a:prstTxWarp prst="textNoShape">
-                          <a:avLst/>
-                        </a:prstTxWarp>
-                        <a:noAutofit/>
-                      </wps:bodyPr>
-                    </wps:wsp>
-                  </a:graphicData>
-                </a:graphic>
-                <wp14:sizeRelH relativeFrom="margin">
-                  <wp14:pctWidth>0</wp14:pctWidth>
-                </wp14:sizeRelH>
-                <wp14:sizeRelV relativeFrom="margin">
-                  <wp14:pctHeight>0</wp14:pctHeight>
-                </wp14:sizeRelV>
-              </wp:anchor>
-            </w:drawing>
-          </mc:Choice>
-          <mc:Fallback>
-            <w:pict>
-              <v:shape w14:anchorId="30FE07A7" id="Text Box 37" o:spid="_x0000_s1033" type="#_x0000_t202" alt="Applicant Name" style="position:absolute;margin-left:-46.05pt;margin-top:697.2pt;width:185.35pt;height:21.6pt;z-index:251668480;visibility:visible;mso-wrap-style:square;mso-width-percent:0;mso-height-percent:0;mso-wrap-distance-left:9pt;mso-wrap-distance-top:0;mso-wrap-distance-right:9pt;mso-wrap-distance-bottom:0;mso-position-horizontal:absolute;mso-position-horizontal-relative:text;mso-position-vertical:absolute;mso-position-vertical-relative:text;mso-width-percent:0;mso-height-percent:0;mso-width-relative:margin;mso-height-relative:margin;v-text-anchor:top" o:gfxdata="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" filled="f" stroked="f" strokeweight=".5pt">
-                <v:textbox>
-                  <w:txbxContent>
-                    <w:p>
-                      <w:pPr>
-                        <w:widowControl w:val="0"/>
-                        <w:autoSpaceDE w:val="0"/>
-                        <w:spacing w:after="0" w:line="240" w:lineRule="auto"/>
-                        <w:rPr>
-                          <w:rFonts w:ascii="Times New Roman" w:hAnsi="Times New Roman"/>
-                          <w:kern w:val="0"/>
-                          <w:sz w:val="18"/>
-                          <w:szCs w:val="18"/>
-                        </w:rPr>
-                      </w:pPr>
-                    </w:p>
-                    <w:p>
-                      <w:pPr>
-                        <w:rPr>
-                          <w:b/>
-                          <w:bCs/>
-                        </w:rPr>
-                      </w:pPr>
-                    </w:p>
-                  </w:txbxContent>
-                </v:textbox>
-              </v:shape>
-            </w:pict>
-          </mc:Fallback>
-        </mc:AlternateContent>
-      </w:r>
-      <w:r>
-        <w:rPr>
           <w:rFonts w:ascii="Times New Roman" w:hAnsi="Times New Roman"/>
           <w:noProof/>
           <w:kern w:val="0"/>
@@ -10614,7 +10306,7 @@
           </mc:Choice>
           <mc:Fallback>
             <w:pict>
-              <v:shape w14:anchorId="231CE085" id="_x0000_s1034" type="#_x0000_t202" style="position:absolute;margin-left:7.2pt;margin-top:137.4pt;width:214.2pt;height:548.9pt;z-index:251665408;visibility:visible;mso-wrap-style:square;mso-width-percent:0;mso-height-percent:0;mso-wrap-distance-left:9pt;mso-wrap-distance-top:0;mso-wrap-distance-right:9pt;mso-wrap-distance-bottom:0;mso-position-horizontal:absolute;mso-position-horizontal-relative:page;mso-position-vertical:absolute;mso-position-vertical-relative:text;mso-width-percent:0;mso-height-percent:0;mso-width-relative:margin;mso-height-relative:margin;v-text-anchor:top" o:gfxdata="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" filled="f" stroked="f" strokeweight=".5pt">
+              <v:shape w14:anchorId="231CE085" id="_x0000_s1033" type="#_x0000_t202" style="position:absolute;margin-left:7.2pt;margin-top:137.4pt;width:214.2pt;height:548.9pt;z-index:251665408;visibility:visible;mso-wrap-style:square;mso-width-percent:0;mso-height-percent:0;mso-wrap-distance-left:9pt;mso-wrap-distance-top:0;mso-wrap-distance-right:9pt;mso-wrap-distance-bottom:0;mso-position-horizontal:absolute;mso-position-horizontal-relative:page;mso-position-vertical:absolute;mso-position-vertical-relative:text;mso-width-percent:0;mso-height-percent:0;mso-width-relative:margin;mso-height-relative:margin;v-text-anchor:top" o:gfxdata="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" filled="f" stroked="f" strokeweight=".5pt">
                 <v:textbox>
                   <w:txbxContent>
                     <w:p>
@@ -18508,7 +18200,7 @@
           </mc:Choice>
           <mc:Fallback>
             <w:pict>
-              <v:group w14:anchorId="458FEE38" id="Group 583640925" o:spid="_x0000_s1035" style="position:absolute;margin-left:-60.6pt;margin-top:-11.4pt;width:595.5pt;height:841.4pt;z-index:251659264;mso-position-horizontal-relative:margin;mso-position-vertical-relative:margin;mso-width-relative:margin;mso-height-relative:margin" coordsize="75628,106859" o:gfxdata="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">
+              <v:group w14:anchorId="458FEE38" id="Group 583640925" o:spid="_x0000_s1034" style="position:absolute;margin-left:-60.6pt;margin-top:-11.4pt;width:595.5pt;height:841.4pt;z-index:251659264;mso-position-horizontal-relative:margin;mso-position-vertical-relative:margin;mso-width-relative:margin;mso-height-relative:margin" coordsize="75628,106859" o:gfxdata="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">
                 <v:shapetype id="_x0000_t75" coordsize="21600,21600" o:spt="75" o:preferrelative="t" path="m@4@5l@4@11@9@11@9@5xe" filled="f" stroked="f">
                   <v:stroke joinstyle="miter"/>
                   <v:formulas>
@@ -18528,13 +18220,13 @@
                   <v:path o:extrusionok="f" gradientshapeok="t" o:connecttype="rect"/>
                   <o:lock v:ext="edit" aspectratio="t"/>
                 </v:shapetype>
-                <v:shape id="Picture 296968587" o:spid="_x0000_s1036" type="#_x0000_t75" style="position:absolute;width:75438;height:15575;visibility:visible;mso-wrap-style:square" o:gfxdata="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">
+                <v:shape id="Picture 296968587" o:spid="_x0000_s1035" type="#_x0000_t75" style="position:absolute;width:75438;height:15575;visibility:visible;mso-wrap-style:square" o:gfxdata="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">
                   <v:imagedata r:id="rId13" o:title=""/>
                 </v:shape>
-                <v:shape id="Picture 1795248927" o:spid="_x0000_s1037" type="#_x0000_t75" style="position:absolute;left:910;top:18578;width:22669;height:70033;visibility:visible;mso-wrap-style:square" o:gfxdata="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">
+                <v:shape id="Picture 1795248927" o:spid="_x0000_s1036" type="#_x0000_t75" style="position:absolute;left:910;top:18578;width:22669;height:70033;visibility:visible;mso-wrap-style:square" o:gfxdata="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">
                   <v:imagedata r:id="rId14" o:title=""/>
                 </v:shape>
-                <v:rect id="Rectangle 2113903759" o:spid="_x0000_s1038" style="position:absolute;left:28571;top:5411;width:24546;height:2331;visibility:visible;mso-wrap-style:square;v-text-anchor:top" o:gfxdata="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" filled="f" stroked="f">
+                <v:rect id="Rectangle 2113903759" o:spid="_x0000_s1037" style="position:absolute;left:28571;top:5411;width:24546;height:2331;visibility:visible;mso-wrap-style:square;v-text-anchor:top" o:gfxdata="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" filled="f" stroked="f">
                   <v:textbox inset="0,0,0,0">
                     <w:txbxContent>
                       <w:p>
@@ -18613,7 +18305,7 @@
                     </w:txbxContent>
                   </v:textbox>
                 </v:rect>
-                <v:rect id="Rectangle 569965918" o:spid="_x0000_s1039" style="position:absolute;left:31650;top:8800;width:16353;height:2331;visibility:visible;mso-wrap-style:square;v-text-anchor:top" o:gfxdata="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" filled="f" stroked="f">
+                <v:rect id="Rectangle 569965918" o:spid="_x0000_s1038" style="position:absolute;left:31650;top:8800;width:16353;height:2331;visibility:visible;mso-wrap-style:square;v-text-anchor:top" o:gfxdata="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" filled="f" stroked="f">
                   <v:textbox inset="0,0,0,0">
                     <w:txbxContent>
                       <w:p>
@@ -18654,7 +18346,7 @@
                     </w:txbxContent>
                   </v:textbox>
                 </v:rect>
-                <v:rect id="Rectangle 750717535" o:spid="_x0000_s1040" style="position:absolute;left:33223;top:10533;width:12170;height:2331;visibility:visible;mso-wrap-style:square;v-text-anchor:top" o:gfxdata="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" filled="f" stroked="f">
+                <v:rect id="Rectangle 750717535" o:spid="_x0000_s1039" style="position:absolute;left:33223;top:10533;width:12170;height:2331;visibility:visible;mso-wrap-style:square;v-text-anchor:top" o:gfxdata="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" filled="f" stroked="f">
                   <v:textbox inset="0,0,0,0">
                     <w:txbxContent>
                       <w:p>
@@ -18695,10 +18387,10 @@
                     </w:txbxContent>
                   </v:textbox>
                 </v:rect>
-                <v:shape id="Picture 236908872" o:spid="_x0000_s1041" type="#_x0000_t75" style="position:absolute;top:100225;width:75438;height:6634;visibility:visible;mso-wrap-style:square" o:gfxdata="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">
+                <v:shape id="Picture 236908872" o:spid="_x0000_s1040" type="#_x0000_t75" style="position:absolute;top:100225;width:75438;height:6634;visibility:visible;mso-wrap-style:square" o:gfxdata="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">
                   <v:imagedata r:id="rId15" o:title=""/>
                 </v:shape>
-                <v:rect id="Rectangle 1186820149" o:spid="_x0000_s1042" style="position:absolute;left:26983;top:6954;width:28768;height:2973;visibility:visible;mso-wrap-style:square;v-text-anchor:top" o:gfxdata="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" filled="f" stroked="f">
+                <v:rect id="Rectangle 1186820149" o:spid="_x0000_s1041" style="position:absolute;left:26983;top:6954;width:28768;height:2973;visibility:visible;mso-wrap-style:square;v-text-anchor:top" o:gfxdata="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" filled="f" stroked="f">
                   <v:textbox inset="0,0,0,0">
                     <w:txbxContent>
                       <w:p>
@@ -18818,13 +18510,13 @@
                     </w:txbxContent>
                   </v:textbox>
                 </v:rect>
-                <v:shape id="Picture 1253694580" o:spid="_x0000_s1043" type="#_x0000_t75" style="position:absolute;left:55337;top:4101;width:9388;height:9632;visibility:visible;mso-wrap-style:square" o:gfxdata="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">
+                <v:shape id="Picture 1253694580" o:spid="_x0000_s1042" type="#_x0000_t75" style="position:absolute;left:55337;top:4101;width:9388;height:9632;visibility:visible;mso-wrap-style:square" o:gfxdata="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">
                   <v:imagedata r:id="rId16" o:title=""/>
                 </v:shape>
-                <v:shape id="Picture 262424483" o:spid="_x0000_s1044" type="#_x0000_t75" style="position:absolute;left:6699;top:5327;width:8763;height:8763;visibility:visible;mso-wrap-style:square" o:gfxdata="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">
+                <v:shape id="Picture 262424483" o:spid="_x0000_s1043" type="#_x0000_t75" style="position:absolute;left:6699;top:5327;width:8763;height:8763;visibility:visible;mso-wrap-style:square" o:gfxdata="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">
                   <v:imagedata r:id="rId17" o:title=""/>
                 </v:shape>
-                <v:shape id="Shape 26" o:spid="_x0000_s1045" style="position:absolute;left:190;top:17490;width:75438;height:0;visibility:visible;mso-wrap-style:square;v-text-anchor:top" coordsize="7543843,0" o:gfxdata="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" path="m7543843,l,e" filled="f" strokeweight="3pt">
+                <v:shape id="Shape 26" o:spid="_x0000_s1044" style="position:absolute;left:190;top:17490;width:75438;height:0;visibility:visible;mso-wrap-style:square;v-text-anchor:top" coordsize="7543843,0" o:gfxdata="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" path="m7543843,l,e" filled="f" strokeweight="3pt">
                   <v:stroke miterlimit="1" joinstyle="miter" endcap="round"/>
                   <v:path arrowok="t" textboxrect="0,0,7543843,0"/>
                 </v:shape>
@@ -19483,7 +19175,6 @@
   <w:style w:type="character" w:default="1" w:styleId="DefaultParagraphFont">
     <w:name w:val="Default Paragraph Font"/>
     <w:uiPriority w:val="1"/>
-    <w:semiHidden/>
     <w:unhideWhenUsed/>
   </w:style>
   <w:style w:type="table" w:default="1" w:styleId="TableNormal">

</xml_diff>